<commit_message>
Fix Update Sinus to TSU and add page eror 404
</commit_message>
<xml_diff>
--- a/bisma/public/assets/Isian Substansi Proposal - LPPM SINUS.docx
+++ b/bisma/public/assets/Isian Substansi Proposal - LPPM SINUS.docx
@@ -1,6 +1,6 @@
 
 <file path=word/document.xml><?xml version="1.0" encoding="utf-8"?>
-<w:document xmlns:wpc="http://schemas.microsoft.com/office/word/2010/wordprocessingCanvas" xmlns:cx="http://schemas.microsoft.com/office/drawing/2014/chartex" xmlns:cx1="http://schemas.microsoft.com/office/drawing/2015/9/8/chartex" xmlns:cx2="http://schemas.microsoft.com/office/drawing/2015/10/21/chartex" xmlns:cx3="http://schemas.microsoft.com/office/drawing/2016/5/9/chartex" xmlns:cx4="http://schemas.microsoft.com/office/drawing/2016/5/10/chartex" xmlns:cx5="http://schemas.microsoft.com/office/drawing/2016/5/11/chartex" xmlns:cx6="http://schemas.microsoft.com/office/drawing/2016/5/12/chartex" xmlns:cx7="http://schemas.microsoft.com/office/drawing/2016/5/13/chartex" xmlns:cx8="http://schemas.microsoft.com/office/drawing/2016/5/14/chartex" xmlns:mc="http://schemas.openxmlformats.org/markup-compatibility/2006" xmlns:aink="http://schemas.microsoft.com/office/drawing/2016/ink" xmlns:am3d="http://schemas.microsoft.com/office/drawing/2017/model3d" xmlns:o="urn:schemas-microsoft-com:office:office" xmlns:oel="http://schemas.microsoft.com/office/2019/extlst" xmlns:r="http://schemas.openxmlformats.org/officeDocument/2006/relationships" xmlns:m="http://schemas.openxmlformats.org/officeDocument/2006/math" xmlns:v="urn:schemas-microsoft-com:vml" xmlns:wp14="http://schemas.microsoft.com/office/word/2010/wordprocessingDrawing" xmlns:wp="http://schemas.openxmlformats.org/drawingml/2006/wordprocessingDrawing" xmlns:w10="urn:schemas-microsoft-com:office:word" xmlns:w="http://schemas.openxmlformats.org/wordprocessingml/2006/main" xmlns:w14="http://schemas.microsoft.com/office/word/2010/wordml" xmlns:w15="http://schemas.microsoft.com/office/word/2012/wordml" xmlns:w16cex="http://schemas.microsoft.com/office/word/2018/wordml/cex" xmlns:w16cid="http://schemas.microsoft.com/office/word/2016/wordml/cid" xmlns:w16="http://schemas.microsoft.com/office/word/2018/wordml" xmlns:w16du="http://schemas.microsoft.com/office/word/2023/wordml/word16du" xmlns:w16sdtdh="http://schemas.microsoft.com/office/word/2020/wordml/sdtdatahash" xmlns:w16se="http://schemas.microsoft.com/office/word/2015/wordml/symex" xmlns:wpg="http://schemas.microsoft.com/office/word/2010/wordprocessingGroup" xmlns:wpi="http://schemas.microsoft.com/office/word/2010/wordprocessingInk" xmlns:wne="http://schemas.microsoft.com/office/word/2006/wordml" xmlns:wps="http://schemas.microsoft.com/office/word/2010/wordprocessingShape" mc:Ignorable="w14 w15 w16se w16cid w16 w16cex w16sdtdh w16du wp14">
+<w:document xmlns:wpc="http://schemas.microsoft.com/office/word/2010/wordprocessingCanvas" xmlns:cx="http://schemas.microsoft.com/office/drawing/2014/chartex" xmlns:cx1="http://schemas.microsoft.com/office/drawing/2015/9/8/chartex" xmlns:cx2="http://schemas.microsoft.com/office/drawing/2015/10/21/chartex" xmlns:cx3="http://schemas.microsoft.com/office/drawing/2016/5/9/chartex" xmlns:cx4="http://schemas.microsoft.com/office/drawing/2016/5/10/chartex" xmlns:cx5="http://schemas.microsoft.com/office/drawing/2016/5/11/chartex" xmlns:cx6="http://schemas.microsoft.com/office/drawing/2016/5/12/chartex" xmlns:cx7="http://schemas.microsoft.com/office/drawing/2016/5/13/chartex" xmlns:cx8="http://schemas.microsoft.com/office/drawing/2016/5/14/chartex" xmlns:mc="http://schemas.openxmlformats.org/markup-compatibility/2006" xmlns:aink="http://schemas.microsoft.com/office/drawing/2016/ink" xmlns:am3d="http://schemas.microsoft.com/office/drawing/2017/model3d" xmlns:o="urn:schemas-microsoft-com:office:office" xmlns:r="http://schemas.openxmlformats.org/officeDocument/2006/relationships" xmlns:m="http://schemas.openxmlformats.org/officeDocument/2006/math" xmlns:v="urn:schemas-microsoft-com:vml" xmlns:wp14="http://schemas.microsoft.com/office/word/2010/wordprocessingDrawing" xmlns:wp="http://schemas.openxmlformats.org/drawingml/2006/wordprocessingDrawing" xmlns:w10="urn:schemas-microsoft-com:office:word" xmlns:w="http://schemas.openxmlformats.org/wordprocessingml/2006/main" xmlns:w14="http://schemas.microsoft.com/office/word/2010/wordml" xmlns:w15="http://schemas.microsoft.com/office/word/2012/wordml" xmlns:w16cex="http://schemas.microsoft.com/office/word/2018/wordml/cex" xmlns:w16cid="http://schemas.microsoft.com/office/word/2016/wordml/cid" xmlns:w16="http://schemas.microsoft.com/office/word/2018/wordml" xmlns:w16sdtdh="http://schemas.microsoft.com/office/word/2020/wordml/sdtdatahash" xmlns:w16se="http://schemas.microsoft.com/office/word/2015/wordml/symex" xmlns:wpg="http://schemas.microsoft.com/office/word/2010/wordprocessingGroup" xmlns:wpi="http://schemas.microsoft.com/office/word/2010/wordprocessingInk" xmlns:wne="http://schemas.microsoft.com/office/word/2006/wordml" xmlns:wps="http://schemas.microsoft.com/office/word/2010/wordprocessingShape" mc:Ignorable="w14 w15 w16se w16cid w16 w16cex w16sdtdh wp14">
   <w:body>
     <w:tbl>
       <w:tblPr>
@@ -93,17 +93,135 @@
                 <w:lang w:eastAsia="en-US"/>
               </w:rPr>
             </w:pPr>
-            <w:r>
-              <w:rPr>
-                <w:bCs/>
-                <w:i/>
-                <w:iCs/>
-                <w:color w:val="000000" w:themeColor="text1"/>
-                <w:sz w:val="22"/>
-                <w:szCs w:val="22"/>
-                <w:lang w:eastAsia="en-US"/>
-              </w:rPr>
-              <w:t>Tuliskan judul usulan penelitian maksimal 20 kata</w:t>
+            <w:proofErr w:type="spellStart"/>
+            <w:r>
+              <w:rPr>
+                <w:bCs/>
+                <w:i/>
+                <w:iCs/>
+                <w:color w:val="000000" w:themeColor="text1"/>
+                <w:sz w:val="22"/>
+                <w:szCs w:val="22"/>
+                <w:lang w:eastAsia="en-US"/>
+              </w:rPr>
+              <w:t>Tuliskan</w:t>
+            </w:r>
+            <w:proofErr w:type="spellEnd"/>
+            <w:r>
+              <w:rPr>
+                <w:bCs/>
+                <w:i/>
+                <w:iCs/>
+                <w:color w:val="000000" w:themeColor="text1"/>
+                <w:sz w:val="22"/>
+                <w:szCs w:val="22"/>
+                <w:lang w:eastAsia="en-US"/>
+              </w:rPr>
+              <w:t xml:space="preserve"> </w:t>
+            </w:r>
+            <w:proofErr w:type="spellStart"/>
+            <w:r>
+              <w:rPr>
+                <w:bCs/>
+                <w:i/>
+                <w:iCs/>
+                <w:color w:val="000000" w:themeColor="text1"/>
+                <w:sz w:val="22"/>
+                <w:szCs w:val="22"/>
+                <w:lang w:eastAsia="en-US"/>
+              </w:rPr>
+              <w:t>judul</w:t>
+            </w:r>
+            <w:proofErr w:type="spellEnd"/>
+            <w:r>
+              <w:rPr>
+                <w:bCs/>
+                <w:i/>
+                <w:iCs/>
+                <w:color w:val="000000" w:themeColor="text1"/>
+                <w:sz w:val="22"/>
+                <w:szCs w:val="22"/>
+                <w:lang w:eastAsia="en-US"/>
+              </w:rPr>
+              <w:t xml:space="preserve"> </w:t>
+            </w:r>
+            <w:proofErr w:type="spellStart"/>
+            <w:r>
+              <w:rPr>
+                <w:bCs/>
+                <w:i/>
+                <w:iCs/>
+                <w:color w:val="000000" w:themeColor="text1"/>
+                <w:sz w:val="22"/>
+                <w:szCs w:val="22"/>
+                <w:lang w:eastAsia="en-US"/>
+              </w:rPr>
+              <w:t>usulan</w:t>
+            </w:r>
+            <w:proofErr w:type="spellEnd"/>
+            <w:r>
+              <w:rPr>
+                <w:bCs/>
+                <w:i/>
+                <w:iCs/>
+                <w:color w:val="000000" w:themeColor="text1"/>
+                <w:sz w:val="22"/>
+                <w:szCs w:val="22"/>
+                <w:lang w:eastAsia="en-US"/>
+              </w:rPr>
+              <w:t xml:space="preserve"> </w:t>
+            </w:r>
+            <w:proofErr w:type="spellStart"/>
+            <w:r>
+              <w:rPr>
+                <w:bCs/>
+                <w:i/>
+                <w:iCs/>
+                <w:color w:val="000000" w:themeColor="text1"/>
+                <w:sz w:val="22"/>
+                <w:szCs w:val="22"/>
+                <w:lang w:eastAsia="en-US"/>
+              </w:rPr>
+              <w:t>penelitian</w:t>
+            </w:r>
+            <w:proofErr w:type="spellEnd"/>
+            <w:r>
+              <w:rPr>
+                <w:bCs/>
+                <w:i/>
+                <w:iCs/>
+                <w:color w:val="000000" w:themeColor="text1"/>
+                <w:sz w:val="22"/>
+                <w:szCs w:val="22"/>
+                <w:lang w:eastAsia="en-US"/>
+              </w:rPr>
+              <w:t xml:space="preserve"> </w:t>
+            </w:r>
+            <w:proofErr w:type="spellStart"/>
+            <w:r>
+              <w:rPr>
+                <w:bCs/>
+                <w:i/>
+                <w:iCs/>
+                <w:color w:val="000000" w:themeColor="text1"/>
+                <w:sz w:val="22"/>
+                <w:szCs w:val="22"/>
+                <w:lang w:eastAsia="en-US"/>
+              </w:rPr>
+              <w:t>maksimal</w:t>
+            </w:r>
+            <w:proofErr w:type="spellEnd"/>
+            <w:r>
+              <w:rPr>
+                <w:bCs/>
+                <w:i/>
+                <w:iCs/>
+                <w:color w:val="000000" w:themeColor="text1"/>
+                <w:sz w:val="22"/>
+                <w:szCs w:val="22"/>
+                <w:lang w:eastAsia="en-US"/>
+              </w:rPr>
+              <w:t xml:space="preserve"> 20 kata</w:t>
             </w:r>
           </w:p>
         </w:tc>
@@ -127,7 +245,21 @@
               <w:rPr>
                 <w:color w:val="000000" w:themeColor="text1"/>
               </w:rPr>
-              <w:t>…………………………………...………………………………………………………………………………………………………………………………………………………… dst.</w:t>
+              <w:t xml:space="preserve">…………………………………...………………………………………………………………………………………………………………………………………………………… </w:t>
+            </w:r>
+            <w:proofErr w:type="spellStart"/>
+            <w:r>
+              <w:rPr>
+                <w:color w:val="000000" w:themeColor="text1"/>
+              </w:rPr>
+              <w:t>dst</w:t>
+            </w:r>
+            <w:proofErr w:type="spellEnd"/>
+            <w:r>
+              <w:rPr>
+                <w:color w:val="000000" w:themeColor="text1"/>
+              </w:rPr>
+              <w:t>.</w:t>
             </w:r>
             <w:r>
               <w:rPr>
@@ -209,16 +341,260 @@
                 <w:lang w:eastAsia="en-US"/>
               </w:rPr>
             </w:pPr>
-            <w:r>
-              <w:rPr>
-                <w:bCs/>
-                <w:color w:val="000000" w:themeColor="text1"/>
-                <w:sz w:val="22"/>
-                <w:szCs w:val="22"/>
-                <w:lang w:eastAsia="en-US"/>
-              </w:rPr>
-              <w:t>Isian ringkasan penelitian tidak lebih dari 300 kata yang berisi urgensi, tujuan, metode, dan luaran yang ditargetkan</w:t>
-            </w:r>
+            <w:proofErr w:type="spellStart"/>
+            <w:r>
+              <w:rPr>
+                <w:bCs/>
+                <w:color w:val="000000" w:themeColor="text1"/>
+                <w:sz w:val="22"/>
+                <w:szCs w:val="22"/>
+                <w:lang w:eastAsia="en-US"/>
+              </w:rPr>
+              <w:t>Isian</w:t>
+            </w:r>
+            <w:proofErr w:type="spellEnd"/>
+            <w:r>
+              <w:rPr>
+                <w:bCs/>
+                <w:color w:val="000000" w:themeColor="text1"/>
+                <w:sz w:val="22"/>
+                <w:szCs w:val="22"/>
+                <w:lang w:eastAsia="en-US"/>
+              </w:rPr>
+              <w:t xml:space="preserve"> </w:t>
+            </w:r>
+            <w:proofErr w:type="spellStart"/>
+            <w:r>
+              <w:rPr>
+                <w:bCs/>
+                <w:color w:val="000000" w:themeColor="text1"/>
+                <w:sz w:val="22"/>
+                <w:szCs w:val="22"/>
+                <w:lang w:eastAsia="en-US"/>
+              </w:rPr>
+              <w:t>ringkasan</w:t>
+            </w:r>
+            <w:proofErr w:type="spellEnd"/>
+            <w:r>
+              <w:rPr>
+                <w:bCs/>
+                <w:color w:val="000000" w:themeColor="text1"/>
+                <w:sz w:val="22"/>
+                <w:szCs w:val="22"/>
+                <w:lang w:eastAsia="en-US"/>
+              </w:rPr>
+              <w:t xml:space="preserve"> </w:t>
+            </w:r>
+            <w:proofErr w:type="spellStart"/>
+            <w:r>
+              <w:rPr>
+                <w:bCs/>
+                <w:color w:val="000000" w:themeColor="text1"/>
+                <w:sz w:val="22"/>
+                <w:szCs w:val="22"/>
+                <w:lang w:eastAsia="en-US"/>
+              </w:rPr>
+              <w:t>penelitian</w:t>
+            </w:r>
+            <w:proofErr w:type="spellEnd"/>
+            <w:r>
+              <w:rPr>
+                <w:bCs/>
+                <w:color w:val="000000" w:themeColor="text1"/>
+                <w:sz w:val="22"/>
+                <w:szCs w:val="22"/>
+                <w:lang w:eastAsia="en-US"/>
+              </w:rPr>
+              <w:t xml:space="preserve"> </w:t>
+            </w:r>
+            <w:proofErr w:type="spellStart"/>
+            <w:r>
+              <w:rPr>
+                <w:bCs/>
+                <w:color w:val="000000" w:themeColor="text1"/>
+                <w:sz w:val="22"/>
+                <w:szCs w:val="22"/>
+                <w:lang w:eastAsia="en-US"/>
+              </w:rPr>
+              <w:t>tidak</w:t>
+            </w:r>
+            <w:proofErr w:type="spellEnd"/>
+            <w:r>
+              <w:rPr>
+                <w:bCs/>
+                <w:color w:val="000000" w:themeColor="text1"/>
+                <w:sz w:val="22"/>
+                <w:szCs w:val="22"/>
+                <w:lang w:eastAsia="en-US"/>
+              </w:rPr>
+              <w:t xml:space="preserve"> </w:t>
+            </w:r>
+            <w:proofErr w:type="spellStart"/>
+            <w:r>
+              <w:rPr>
+                <w:bCs/>
+                <w:color w:val="000000" w:themeColor="text1"/>
+                <w:sz w:val="22"/>
+                <w:szCs w:val="22"/>
+                <w:lang w:eastAsia="en-US"/>
+              </w:rPr>
+              <w:t>lebih</w:t>
+            </w:r>
+            <w:proofErr w:type="spellEnd"/>
+            <w:r>
+              <w:rPr>
+                <w:bCs/>
+                <w:color w:val="000000" w:themeColor="text1"/>
+                <w:sz w:val="22"/>
+                <w:szCs w:val="22"/>
+                <w:lang w:eastAsia="en-US"/>
+              </w:rPr>
+              <w:t xml:space="preserve"> </w:t>
+            </w:r>
+            <w:proofErr w:type="spellStart"/>
+            <w:r>
+              <w:rPr>
+                <w:bCs/>
+                <w:color w:val="000000" w:themeColor="text1"/>
+                <w:sz w:val="22"/>
+                <w:szCs w:val="22"/>
+                <w:lang w:eastAsia="en-US"/>
+              </w:rPr>
+              <w:t>dari</w:t>
+            </w:r>
+            <w:proofErr w:type="spellEnd"/>
+            <w:r>
+              <w:rPr>
+                <w:bCs/>
+                <w:color w:val="000000" w:themeColor="text1"/>
+                <w:sz w:val="22"/>
+                <w:szCs w:val="22"/>
+                <w:lang w:eastAsia="en-US"/>
+              </w:rPr>
+              <w:t xml:space="preserve"> 300 kata yang </w:t>
+            </w:r>
+            <w:proofErr w:type="spellStart"/>
+            <w:r>
+              <w:rPr>
+                <w:bCs/>
+                <w:color w:val="000000" w:themeColor="text1"/>
+                <w:sz w:val="22"/>
+                <w:szCs w:val="22"/>
+                <w:lang w:eastAsia="en-US"/>
+              </w:rPr>
+              <w:t>berisi</w:t>
+            </w:r>
+            <w:proofErr w:type="spellEnd"/>
+            <w:r>
+              <w:rPr>
+                <w:bCs/>
+                <w:color w:val="000000" w:themeColor="text1"/>
+                <w:sz w:val="22"/>
+                <w:szCs w:val="22"/>
+                <w:lang w:eastAsia="en-US"/>
+              </w:rPr>
+              <w:t xml:space="preserve"> </w:t>
+            </w:r>
+            <w:proofErr w:type="spellStart"/>
+            <w:r>
+              <w:rPr>
+                <w:bCs/>
+                <w:color w:val="000000" w:themeColor="text1"/>
+                <w:sz w:val="22"/>
+                <w:szCs w:val="22"/>
+                <w:lang w:eastAsia="en-US"/>
+              </w:rPr>
+              <w:t>urgensi</w:t>
+            </w:r>
+            <w:proofErr w:type="spellEnd"/>
+            <w:r>
+              <w:rPr>
+                <w:bCs/>
+                <w:color w:val="000000" w:themeColor="text1"/>
+                <w:sz w:val="22"/>
+                <w:szCs w:val="22"/>
+                <w:lang w:eastAsia="en-US"/>
+              </w:rPr>
+              <w:t xml:space="preserve">, </w:t>
+            </w:r>
+            <w:proofErr w:type="spellStart"/>
+            <w:r>
+              <w:rPr>
+                <w:bCs/>
+                <w:color w:val="000000" w:themeColor="text1"/>
+                <w:sz w:val="22"/>
+                <w:szCs w:val="22"/>
+                <w:lang w:eastAsia="en-US"/>
+              </w:rPr>
+              <w:t>tujuan</w:t>
+            </w:r>
+            <w:proofErr w:type="spellEnd"/>
+            <w:r>
+              <w:rPr>
+                <w:bCs/>
+                <w:color w:val="000000" w:themeColor="text1"/>
+                <w:sz w:val="22"/>
+                <w:szCs w:val="22"/>
+                <w:lang w:eastAsia="en-US"/>
+              </w:rPr>
+              <w:t xml:space="preserve">, </w:t>
+            </w:r>
+            <w:proofErr w:type="spellStart"/>
+            <w:r>
+              <w:rPr>
+                <w:bCs/>
+                <w:color w:val="000000" w:themeColor="text1"/>
+                <w:sz w:val="22"/>
+                <w:szCs w:val="22"/>
+                <w:lang w:eastAsia="en-US"/>
+              </w:rPr>
+              <w:t>metode</w:t>
+            </w:r>
+            <w:proofErr w:type="spellEnd"/>
+            <w:r>
+              <w:rPr>
+                <w:bCs/>
+                <w:color w:val="000000" w:themeColor="text1"/>
+                <w:sz w:val="22"/>
+                <w:szCs w:val="22"/>
+                <w:lang w:eastAsia="en-US"/>
+              </w:rPr>
+              <w:t xml:space="preserve">, dan </w:t>
+            </w:r>
+            <w:proofErr w:type="spellStart"/>
+            <w:r>
+              <w:rPr>
+                <w:bCs/>
+                <w:color w:val="000000" w:themeColor="text1"/>
+                <w:sz w:val="22"/>
+                <w:szCs w:val="22"/>
+                <w:lang w:eastAsia="en-US"/>
+              </w:rPr>
+              <w:t>luaran</w:t>
+            </w:r>
+            <w:proofErr w:type="spellEnd"/>
+            <w:r>
+              <w:rPr>
+                <w:bCs/>
+                <w:color w:val="000000" w:themeColor="text1"/>
+                <w:sz w:val="22"/>
+                <w:szCs w:val="22"/>
+                <w:lang w:eastAsia="en-US"/>
+              </w:rPr>
+              <w:t xml:space="preserve"> yang </w:t>
+            </w:r>
+            <w:proofErr w:type="spellStart"/>
+            <w:r>
+              <w:rPr>
+                <w:bCs/>
+                <w:color w:val="000000" w:themeColor="text1"/>
+                <w:sz w:val="22"/>
+                <w:szCs w:val="22"/>
+                <w:lang w:eastAsia="en-US"/>
+              </w:rPr>
+              <w:t>ditargetkan</w:t>
+            </w:r>
+            <w:proofErr w:type="spellEnd"/>
           </w:p>
         </w:tc>
       </w:tr>
@@ -324,7 +700,51 @@
                 <w:szCs w:val="22"/>
                 <w:lang w:eastAsia="en-US"/>
               </w:rPr>
-              <w:t>Kata kunci maksimal 5 kata</w:t>
+              <w:t xml:space="preserve">Kata </w:t>
+            </w:r>
+            <w:proofErr w:type="spellStart"/>
+            <w:r>
+              <w:rPr>
+                <w:bCs/>
+                <w:color w:val="000000" w:themeColor="text1"/>
+                <w:sz w:val="22"/>
+                <w:szCs w:val="22"/>
+                <w:lang w:eastAsia="en-US"/>
+              </w:rPr>
+              <w:t>kunci</w:t>
+            </w:r>
+            <w:proofErr w:type="spellEnd"/>
+            <w:r>
+              <w:rPr>
+                <w:bCs/>
+                <w:color w:val="000000" w:themeColor="text1"/>
+                <w:sz w:val="22"/>
+                <w:szCs w:val="22"/>
+                <w:lang w:eastAsia="en-US"/>
+              </w:rPr>
+              <w:t xml:space="preserve"> </w:t>
+            </w:r>
+            <w:proofErr w:type="spellStart"/>
+            <w:r>
+              <w:rPr>
+                <w:bCs/>
+                <w:color w:val="000000" w:themeColor="text1"/>
+                <w:sz w:val="22"/>
+                <w:szCs w:val="22"/>
+                <w:lang w:eastAsia="en-US"/>
+              </w:rPr>
+              <w:t>maksimal</w:t>
+            </w:r>
+            <w:proofErr w:type="spellEnd"/>
+            <w:r>
+              <w:rPr>
+                <w:bCs/>
+                <w:color w:val="000000" w:themeColor="text1"/>
+                <w:sz w:val="22"/>
+                <w:szCs w:val="22"/>
+                <w:lang w:eastAsia="en-US"/>
+              </w:rPr>
+              <w:t xml:space="preserve"> 5 kata</w:t>
             </w:r>
           </w:p>
         </w:tc>
@@ -342,7 +762,15 @@
               <w:spacing w:before="120"/>
             </w:pPr>
             <w:r>
-              <w:t>Kata_kunci_1; kata_kunci2; ……….  dst.</w:t>
+              <w:t xml:space="preserve">Kata_kunci_1; kata_kunci2; ……….  </w:t>
+            </w:r>
+            <w:proofErr w:type="spellStart"/>
+            <w:r>
+              <w:t>dst</w:t>
+            </w:r>
+            <w:proofErr w:type="spellEnd"/>
+            <w:r>
+              <w:t>.</w:t>
             </w:r>
           </w:p>
         </w:tc>
@@ -418,14 +846,145 @@
                 <w:lang w:eastAsia="en-US"/>
               </w:rPr>
             </w:pPr>
-            <w:r>
-              <w:rPr>
-                <w:color w:val="000000" w:themeColor="text1"/>
-                <w:sz w:val="22"/>
-                <w:szCs w:val="22"/>
-                <w:lang w:eastAsia="en-US"/>
-              </w:rPr>
-              <w:t xml:space="preserve">Pendahuluan penelitian tidak lebih dari 1000 kata yang terdiri dari: </w:t>
+            <w:proofErr w:type="spellStart"/>
+            <w:r>
+              <w:rPr>
+                <w:color w:val="000000" w:themeColor="text1"/>
+                <w:sz w:val="22"/>
+                <w:szCs w:val="22"/>
+                <w:lang w:eastAsia="en-US"/>
+              </w:rPr>
+              <w:t>Pendahuluan</w:t>
+            </w:r>
+            <w:proofErr w:type="spellEnd"/>
+            <w:r>
+              <w:rPr>
+                <w:color w:val="000000" w:themeColor="text1"/>
+                <w:sz w:val="22"/>
+                <w:szCs w:val="22"/>
+                <w:lang w:eastAsia="en-US"/>
+              </w:rPr>
+              <w:t xml:space="preserve"> </w:t>
+            </w:r>
+            <w:proofErr w:type="spellStart"/>
+            <w:r>
+              <w:rPr>
+                <w:color w:val="000000" w:themeColor="text1"/>
+                <w:sz w:val="22"/>
+                <w:szCs w:val="22"/>
+                <w:lang w:eastAsia="en-US"/>
+              </w:rPr>
+              <w:t>penelitian</w:t>
+            </w:r>
+            <w:proofErr w:type="spellEnd"/>
+            <w:r>
+              <w:rPr>
+                <w:color w:val="000000" w:themeColor="text1"/>
+                <w:sz w:val="22"/>
+                <w:szCs w:val="22"/>
+                <w:lang w:eastAsia="en-US"/>
+              </w:rPr>
+              <w:t xml:space="preserve"> </w:t>
+            </w:r>
+            <w:proofErr w:type="spellStart"/>
+            <w:r>
+              <w:rPr>
+                <w:color w:val="000000" w:themeColor="text1"/>
+                <w:sz w:val="22"/>
+                <w:szCs w:val="22"/>
+                <w:lang w:eastAsia="en-US"/>
+              </w:rPr>
+              <w:t>tidak</w:t>
+            </w:r>
+            <w:proofErr w:type="spellEnd"/>
+            <w:r>
+              <w:rPr>
+                <w:color w:val="000000" w:themeColor="text1"/>
+                <w:sz w:val="22"/>
+                <w:szCs w:val="22"/>
+                <w:lang w:eastAsia="en-US"/>
+              </w:rPr>
+              <w:t xml:space="preserve"> </w:t>
+            </w:r>
+            <w:proofErr w:type="spellStart"/>
+            <w:r>
+              <w:rPr>
+                <w:color w:val="000000" w:themeColor="text1"/>
+                <w:sz w:val="22"/>
+                <w:szCs w:val="22"/>
+                <w:lang w:eastAsia="en-US"/>
+              </w:rPr>
+              <w:t>lebih</w:t>
+            </w:r>
+            <w:proofErr w:type="spellEnd"/>
+            <w:r>
+              <w:rPr>
+                <w:color w:val="000000" w:themeColor="text1"/>
+                <w:sz w:val="22"/>
+                <w:szCs w:val="22"/>
+                <w:lang w:eastAsia="en-US"/>
+              </w:rPr>
+              <w:t xml:space="preserve"> </w:t>
+            </w:r>
+            <w:proofErr w:type="spellStart"/>
+            <w:r>
+              <w:rPr>
+                <w:color w:val="000000" w:themeColor="text1"/>
+                <w:sz w:val="22"/>
+                <w:szCs w:val="22"/>
+                <w:lang w:eastAsia="en-US"/>
+              </w:rPr>
+              <w:t>dari</w:t>
+            </w:r>
+            <w:proofErr w:type="spellEnd"/>
+            <w:r>
+              <w:rPr>
+                <w:color w:val="000000" w:themeColor="text1"/>
+                <w:sz w:val="22"/>
+                <w:szCs w:val="22"/>
+                <w:lang w:eastAsia="en-US"/>
+              </w:rPr>
+              <w:t xml:space="preserve"> 1000 kata yang </w:t>
+            </w:r>
+            <w:proofErr w:type="spellStart"/>
+            <w:r>
+              <w:rPr>
+                <w:color w:val="000000" w:themeColor="text1"/>
+                <w:sz w:val="22"/>
+                <w:szCs w:val="22"/>
+                <w:lang w:eastAsia="en-US"/>
+              </w:rPr>
+              <w:t>terdiri</w:t>
+            </w:r>
+            <w:proofErr w:type="spellEnd"/>
+            <w:r>
+              <w:rPr>
+                <w:color w:val="000000" w:themeColor="text1"/>
+                <w:sz w:val="22"/>
+                <w:szCs w:val="22"/>
+                <w:lang w:eastAsia="en-US"/>
+              </w:rPr>
+              <w:t xml:space="preserve"> </w:t>
+            </w:r>
+            <w:proofErr w:type="spellStart"/>
+            <w:r>
+              <w:rPr>
+                <w:color w:val="000000" w:themeColor="text1"/>
+                <w:sz w:val="22"/>
+                <w:szCs w:val="22"/>
+                <w:lang w:eastAsia="en-US"/>
+              </w:rPr>
+              <w:t>dari</w:t>
+            </w:r>
+            <w:proofErr w:type="spellEnd"/>
+            <w:r>
+              <w:rPr>
+                <w:color w:val="000000" w:themeColor="text1"/>
+                <w:sz w:val="22"/>
+                <w:szCs w:val="22"/>
+                <w:lang w:eastAsia="en-US"/>
+              </w:rPr>
+              <w:t xml:space="preserve">: </w:t>
             </w:r>
           </w:p>
           <w:p>
@@ -521,7 +1080,67 @@
                 <w:szCs w:val="22"/>
                 <w:lang w:eastAsia="en-US"/>
               </w:rPr>
-              <w:t xml:space="preserve">State of the art dan kebaruan </w:t>
+              <w:t xml:space="preserve">State </w:t>
+            </w:r>
+            <w:proofErr w:type="spellStart"/>
+            <w:r>
+              <w:rPr>
+                <w:color w:val="000000" w:themeColor="text1"/>
+                <w:sz w:val="22"/>
+                <w:szCs w:val="22"/>
+                <w:lang w:eastAsia="en-US"/>
+              </w:rPr>
+              <w:t>of</w:t>
+            </w:r>
+            <w:proofErr w:type="spellEnd"/>
+            <w:r>
+              <w:rPr>
+                <w:color w:val="000000" w:themeColor="text1"/>
+                <w:sz w:val="22"/>
+                <w:szCs w:val="22"/>
+                <w:lang w:eastAsia="en-US"/>
+              </w:rPr>
+              <w:t xml:space="preserve"> </w:t>
+            </w:r>
+            <w:proofErr w:type="spellStart"/>
+            <w:r>
+              <w:rPr>
+                <w:color w:val="000000" w:themeColor="text1"/>
+                <w:sz w:val="22"/>
+                <w:szCs w:val="22"/>
+                <w:lang w:eastAsia="en-US"/>
+              </w:rPr>
+              <w:t>the</w:t>
+            </w:r>
+            <w:proofErr w:type="spellEnd"/>
+            <w:r>
+              <w:rPr>
+                <w:color w:val="000000" w:themeColor="text1"/>
+                <w:sz w:val="22"/>
+                <w:szCs w:val="22"/>
+                <w:lang w:eastAsia="en-US"/>
+              </w:rPr>
+              <w:t xml:space="preserve"> </w:t>
+            </w:r>
+            <w:proofErr w:type="spellStart"/>
+            <w:r>
+              <w:rPr>
+                <w:color w:val="000000" w:themeColor="text1"/>
+                <w:sz w:val="22"/>
+                <w:szCs w:val="22"/>
+                <w:lang w:eastAsia="en-US"/>
+              </w:rPr>
+              <w:t>art</w:t>
+            </w:r>
+            <w:proofErr w:type="spellEnd"/>
+            <w:r>
+              <w:rPr>
+                <w:color w:val="000000" w:themeColor="text1"/>
+                <w:sz w:val="22"/>
+                <w:szCs w:val="22"/>
+                <w:lang w:eastAsia="en-US"/>
+              </w:rPr>
+              <w:t xml:space="preserve"> dan kebaruan </w:t>
             </w:r>
           </w:p>
           <w:p>
@@ -553,7 +1172,27 @@
                 <w:szCs w:val="22"/>
                 <w:lang w:eastAsia="en-US"/>
               </w:rPr>
-              <w:t xml:space="preserve">Peta jalan (road map) penelitian 5 tahun </w:t>
+              <w:t>Peta jalan (</w:t>
+            </w:r>
+            <w:proofErr w:type="spellStart"/>
+            <w:r>
+              <w:rPr>
+                <w:color w:val="000000" w:themeColor="text1"/>
+                <w:sz w:val="22"/>
+                <w:szCs w:val="22"/>
+                <w:lang w:eastAsia="en-US"/>
+              </w:rPr>
+              <w:t>road</w:t>
+            </w:r>
+            <w:proofErr w:type="spellEnd"/>
+            <w:r>
+              <w:rPr>
+                <w:color w:val="000000" w:themeColor="text1"/>
+                <w:sz w:val="22"/>
+                <w:szCs w:val="22"/>
+                <w:lang w:eastAsia="en-US"/>
+              </w:rPr>
+              <w:t xml:space="preserve"> map) penelitian 5 tahun </w:t>
             </w:r>
           </w:p>
           <w:p>
@@ -576,14 +1215,25 @@
                 <w:lang w:eastAsia="en-US"/>
               </w:rPr>
             </w:pPr>
-            <w:r>
-              <w:rPr>
-                <w:color w:val="000000" w:themeColor="text1"/>
-                <w:sz w:val="22"/>
-                <w:szCs w:val="22"/>
-                <w:lang w:eastAsia="en-US"/>
-              </w:rPr>
-              <w:t>Sitasi disusun dan ditulis berdasarkan sistem nomor sesuai dengan urutan pengutipan</w:t>
+            <w:proofErr w:type="spellStart"/>
+            <w:r>
+              <w:rPr>
+                <w:color w:val="000000" w:themeColor="text1"/>
+                <w:sz w:val="22"/>
+                <w:szCs w:val="22"/>
+                <w:lang w:eastAsia="en-US"/>
+              </w:rPr>
+              <w:t>Sitasi</w:t>
+            </w:r>
+            <w:proofErr w:type="spellEnd"/>
+            <w:r>
+              <w:rPr>
+                <w:color w:val="000000" w:themeColor="text1"/>
+                <w:sz w:val="22"/>
+                <w:szCs w:val="22"/>
+                <w:lang w:eastAsia="en-US"/>
+              </w:rPr>
+              <w:t xml:space="preserve"> disusun dan ditulis berdasarkan sistem nomor sesuai dengan urutan pengutipan</w:t>
             </w:r>
           </w:p>
         </w:tc>
@@ -619,8 +1269,72 @@
                 <w:color w:val="000000" w:themeColor="text1"/>
                 <w:lang w:eastAsia="en-US"/>
               </w:rPr>
-              <w:t>D.1. Latar Belakang dan Rumusan Masalah</w:t>
-            </w:r>
+              <w:t xml:space="preserve">D.1. </w:t>
+            </w:r>
+            <w:proofErr w:type="spellStart"/>
+            <w:r>
+              <w:rPr>
+                <w:b/>
+                <w:color w:val="000000" w:themeColor="text1"/>
+                <w:lang w:eastAsia="en-US"/>
+              </w:rPr>
+              <w:t>Latar</w:t>
+            </w:r>
+            <w:proofErr w:type="spellEnd"/>
+            <w:r>
+              <w:rPr>
+                <w:b/>
+                <w:color w:val="000000" w:themeColor="text1"/>
+                <w:lang w:eastAsia="en-US"/>
+              </w:rPr>
+              <w:t xml:space="preserve"> </w:t>
+            </w:r>
+            <w:proofErr w:type="spellStart"/>
+            <w:r>
+              <w:rPr>
+                <w:b/>
+                <w:color w:val="000000" w:themeColor="text1"/>
+                <w:lang w:eastAsia="en-US"/>
+              </w:rPr>
+              <w:t>Belakang</w:t>
+            </w:r>
+            <w:proofErr w:type="spellEnd"/>
+            <w:r>
+              <w:rPr>
+                <w:b/>
+                <w:color w:val="000000" w:themeColor="text1"/>
+                <w:lang w:eastAsia="en-US"/>
+              </w:rPr>
+              <w:t xml:space="preserve"> dan </w:t>
+            </w:r>
+            <w:proofErr w:type="spellStart"/>
+            <w:r>
+              <w:rPr>
+                <w:b/>
+                <w:color w:val="000000" w:themeColor="text1"/>
+                <w:lang w:eastAsia="en-US"/>
+              </w:rPr>
+              <w:t>Rumusan</w:t>
+            </w:r>
+            <w:proofErr w:type="spellEnd"/>
+            <w:r>
+              <w:rPr>
+                <w:b/>
+                <w:color w:val="000000" w:themeColor="text1"/>
+                <w:lang w:eastAsia="en-US"/>
+              </w:rPr>
+              <w:t xml:space="preserve"> </w:t>
+            </w:r>
+            <w:proofErr w:type="spellStart"/>
+            <w:r>
+              <w:rPr>
+                <w:b/>
+                <w:color w:val="000000" w:themeColor="text1"/>
+                <w:lang w:eastAsia="en-US"/>
+              </w:rPr>
+              <w:t>Masalah</w:t>
+            </w:r>
+            <w:proofErr w:type="spellEnd"/>
           </w:p>
           <w:p>
             <w:pPr>
@@ -642,18 +1356,358 @@
                 <w:lang w:eastAsia="en-US"/>
               </w:rPr>
             </w:pPr>
-            <w:r>
-              <w:rPr>
-                <w:bCs/>
-                <w:i/>
-                <w:iCs/>
-                <w:color w:val="000000" w:themeColor="text1"/>
-                <w:sz w:val="22"/>
-                <w:szCs w:val="22"/>
-                <w:lang w:eastAsia="en-US"/>
-              </w:rPr>
-              <w:t>Tuliskan latar belakang penelitian dan rumusan permasalahan yang akan diteliti, serta urgensi dari dilakukannya penelitian ini</w:t>
-            </w:r>
+            <w:proofErr w:type="spellStart"/>
+            <w:r>
+              <w:rPr>
+                <w:bCs/>
+                <w:i/>
+                <w:iCs/>
+                <w:color w:val="000000" w:themeColor="text1"/>
+                <w:sz w:val="22"/>
+                <w:szCs w:val="22"/>
+                <w:lang w:eastAsia="en-US"/>
+              </w:rPr>
+              <w:t>Tuliskan</w:t>
+            </w:r>
+            <w:proofErr w:type="spellEnd"/>
+            <w:r>
+              <w:rPr>
+                <w:bCs/>
+                <w:i/>
+                <w:iCs/>
+                <w:color w:val="000000" w:themeColor="text1"/>
+                <w:sz w:val="22"/>
+                <w:szCs w:val="22"/>
+                <w:lang w:eastAsia="en-US"/>
+              </w:rPr>
+              <w:t xml:space="preserve"> </w:t>
+            </w:r>
+            <w:proofErr w:type="spellStart"/>
+            <w:r>
+              <w:rPr>
+                <w:bCs/>
+                <w:i/>
+                <w:iCs/>
+                <w:color w:val="000000" w:themeColor="text1"/>
+                <w:sz w:val="22"/>
+                <w:szCs w:val="22"/>
+                <w:lang w:eastAsia="en-US"/>
+              </w:rPr>
+              <w:t>latar</w:t>
+            </w:r>
+            <w:proofErr w:type="spellEnd"/>
+            <w:r>
+              <w:rPr>
+                <w:bCs/>
+                <w:i/>
+                <w:iCs/>
+                <w:color w:val="000000" w:themeColor="text1"/>
+                <w:sz w:val="22"/>
+                <w:szCs w:val="22"/>
+                <w:lang w:eastAsia="en-US"/>
+              </w:rPr>
+              <w:t xml:space="preserve"> </w:t>
+            </w:r>
+            <w:proofErr w:type="spellStart"/>
+            <w:r>
+              <w:rPr>
+                <w:bCs/>
+                <w:i/>
+                <w:iCs/>
+                <w:color w:val="000000" w:themeColor="text1"/>
+                <w:sz w:val="22"/>
+                <w:szCs w:val="22"/>
+                <w:lang w:eastAsia="en-US"/>
+              </w:rPr>
+              <w:t>belakang</w:t>
+            </w:r>
+            <w:proofErr w:type="spellEnd"/>
+            <w:r>
+              <w:rPr>
+                <w:bCs/>
+                <w:i/>
+                <w:iCs/>
+                <w:color w:val="000000" w:themeColor="text1"/>
+                <w:sz w:val="22"/>
+                <w:szCs w:val="22"/>
+                <w:lang w:eastAsia="en-US"/>
+              </w:rPr>
+              <w:t xml:space="preserve"> </w:t>
+            </w:r>
+            <w:proofErr w:type="spellStart"/>
+            <w:r>
+              <w:rPr>
+                <w:bCs/>
+                <w:i/>
+                <w:iCs/>
+                <w:color w:val="000000" w:themeColor="text1"/>
+                <w:sz w:val="22"/>
+                <w:szCs w:val="22"/>
+                <w:lang w:eastAsia="en-US"/>
+              </w:rPr>
+              <w:t>penelitian</w:t>
+            </w:r>
+            <w:proofErr w:type="spellEnd"/>
+            <w:r>
+              <w:rPr>
+                <w:bCs/>
+                <w:i/>
+                <w:iCs/>
+                <w:color w:val="000000" w:themeColor="text1"/>
+                <w:sz w:val="22"/>
+                <w:szCs w:val="22"/>
+                <w:lang w:eastAsia="en-US"/>
+              </w:rPr>
+              <w:t xml:space="preserve"> dan </w:t>
+            </w:r>
+            <w:proofErr w:type="spellStart"/>
+            <w:r>
+              <w:rPr>
+                <w:bCs/>
+                <w:i/>
+                <w:iCs/>
+                <w:color w:val="000000" w:themeColor="text1"/>
+                <w:sz w:val="22"/>
+                <w:szCs w:val="22"/>
+                <w:lang w:eastAsia="en-US"/>
+              </w:rPr>
+              <w:t>rumusan</w:t>
+            </w:r>
+            <w:proofErr w:type="spellEnd"/>
+            <w:r>
+              <w:rPr>
+                <w:bCs/>
+                <w:i/>
+                <w:iCs/>
+                <w:color w:val="000000" w:themeColor="text1"/>
+                <w:sz w:val="22"/>
+                <w:szCs w:val="22"/>
+                <w:lang w:eastAsia="en-US"/>
+              </w:rPr>
+              <w:t xml:space="preserve"> </w:t>
+            </w:r>
+            <w:proofErr w:type="spellStart"/>
+            <w:r>
+              <w:rPr>
+                <w:bCs/>
+                <w:i/>
+                <w:iCs/>
+                <w:color w:val="000000" w:themeColor="text1"/>
+                <w:sz w:val="22"/>
+                <w:szCs w:val="22"/>
+                <w:lang w:eastAsia="en-US"/>
+              </w:rPr>
+              <w:t>permasalahan</w:t>
+            </w:r>
+            <w:proofErr w:type="spellEnd"/>
+            <w:r>
+              <w:rPr>
+                <w:bCs/>
+                <w:i/>
+                <w:iCs/>
+                <w:color w:val="000000" w:themeColor="text1"/>
+                <w:sz w:val="22"/>
+                <w:szCs w:val="22"/>
+                <w:lang w:eastAsia="en-US"/>
+              </w:rPr>
+              <w:t xml:space="preserve"> yang </w:t>
+            </w:r>
+            <w:proofErr w:type="spellStart"/>
+            <w:r>
+              <w:rPr>
+                <w:bCs/>
+                <w:i/>
+                <w:iCs/>
+                <w:color w:val="000000" w:themeColor="text1"/>
+                <w:sz w:val="22"/>
+                <w:szCs w:val="22"/>
+                <w:lang w:eastAsia="en-US"/>
+              </w:rPr>
+              <w:t>akan</w:t>
+            </w:r>
+            <w:proofErr w:type="spellEnd"/>
+            <w:r>
+              <w:rPr>
+                <w:bCs/>
+                <w:i/>
+                <w:iCs/>
+                <w:color w:val="000000" w:themeColor="text1"/>
+                <w:sz w:val="22"/>
+                <w:szCs w:val="22"/>
+                <w:lang w:eastAsia="en-US"/>
+              </w:rPr>
+              <w:t xml:space="preserve"> </w:t>
+            </w:r>
+            <w:proofErr w:type="spellStart"/>
+            <w:r>
+              <w:rPr>
+                <w:bCs/>
+                <w:i/>
+                <w:iCs/>
+                <w:color w:val="000000" w:themeColor="text1"/>
+                <w:sz w:val="22"/>
+                <w:szCs w:val="22"/>
+                <w:lang w:eastAsia="en-US"/>
+              </w:rPr>
+              <w:t>diteliti</w:t>
+            </w:r>
+            <w:proofErr w:type="spellEnd"/>
+            <w:r>
+              <w:rPr>
+                <w:bCs/>
+                <w:i/>
+                <w:iCs/>
+                <w:color w:val="000000" w:themeColor="text1"/>
+                <w:sz w:val="22"/>
+                <w:szCs w:val="22"/>
+                <w:lang w:eastAsia="en-US"/>
+              </w:rPr>
+              <w:t xml:space="preserve">, </w:t>
+            </w:r>
+            <w:proofErr w:type="spellStart"/>
+            <w:r>
+              <w:rPr>
+                <w:bCs/>
+                <w:i/>
+                <w:iCs/>
+                <w:color w:val="000000" w:themeColor="text1"/>
+                <w:sz w:val="22"/>
+                <w:szCs w:val="22"/>
+                <w:lang w:eastAsia="en-US"/>
+              </w:rPr>
+              <w:t>serta</w:t>
+            </w:r>
+            <w:proofErr w:type="spellEnd"/>
+            <w:r>
+              <w:rPr>
+                <w:bCs/>
+                <w:i/>
+                <w:iCs/>
+                <w:color w:val="000000" w:themeColor="text1"/>
+                <w:sz w:val="22"/>
+                <w:szCs w:val="22"/>
+                <w:lang w:eastAsia="en-US"/>
+              </w:rPr>
+              <w:t xml:space="preserve"> </w:t>
+            </w:r>
+            <w:proofErr w:type="spellStart"/>
+            <w:r>
+              <w:rPr>
+                <w:bCs/>
+                <w:i/>
+                <w:iCs/>
+                <w:color w:val="000000" w:themeColor="text1"/>
+                <w:sz w:val="22"/>
+                <w:szCs w:val="22"/>
+                <w:lang w:eastAsia="en-US"/>
+              </w:rPr>
+              <w:t>urgensi</w:t>
+            </w:r>
+            <w:proofErr w:type="spellEnd"/>
+            <w:r>
+              <w:rPr>
+                <w:bCs/>
+                <w:i/>
+                <w:iCs/>
+                <w:color w:val="000000" w:themeColor="text1"/>
+                <w:sz w:val="22"/>
+                <w:szCs w:val="22"/>
+                <w:lang w:eastAsia="en-US"/>
+              </w:rPr>
+              <w:t xml:space="preserve"> </w:t>
+            </w:r>
+            <w:proofErr w:type="spellStart"/>
+            <w:r>
+              <w:rPr>
+                <w:bCs/>
+                <w:i/>
+                <w:iCs/>
+                <w:color w:val="000000" w:themeColor="text1"/>
+                <w:sz w:val="22"/>
+                <w:szCs w:val="22"/>
+                <w:lang w:eastAsia="en-US"/>
+              </w:rPr>
+              <w:t>dari</w:t>
+            </w:r>
+            <w:proofErr w:type="spellEnd"/>
+            <w:r>
+              <w:rPr>
+                <w:bCs/>
+                <w:i/>
+                <w:iCs/>
+                <w:color w:val="000000" w:themeColor="text1"/>
+                <w:sz w:val="22"/>
+                <w:szCs w:val="22"/>
+                <w:lang w:eastAsia="en-US"/>
+              </w:rPr>
+              <w:t xml:space="preserve"> </w:t>
+            </w:r>
+            <w:proofErr w:type="spellStart"/>
+            <w:r>
+              <w:rPr>
+                <w:bCs/>
+                <w:i/>
+                <w:iCs/>
+                <w:color w:val="000000" w:themeColor="text1"/>
+                <w:sz w:val="22"/>
+                <w:szCs w:val="22"/>
+                <w:lang w:eastAsia="en-US"/>
+              </w:rPr>
+              <w:t>dilakukannya</w:t>
+            </w:r>
+            <w:proofErr w:type="spellEnd"/>
+            <w:r>
+              <w:rPr>
+                <w:bCs/>
+                <w:i/>
+                <w:iCs/>
+                <w:color w:val="000000" w:themeColor="text1"/>
+                <w:sz w:val="22"/>
+                <w:szCs w:val="22"/>
+                <w:lang w:eastAsia="en-US"/>
+              </w:rPr>
+              <w:t xml:space="preserve"> </w:t>
+            </w:r>
+            <w:proofErr w:type="spellStart"/>
+            <w:r>
+              <w:rPr>
+                <w:bCs/>
+                <w:i/>
+                <w:iCs/>
+                <w:color w:val="000000" w:themeColor="text1"/>
+                <w:sz w:val="22"/>
+                <w:szCs w:val="22"/>
+                <w:lang w:eastAsia="en-US"/>
+              </w:rPr>
+              <w:t>penelitian</w:t>
+            </w:r>
+            <w:proofErr w:type="spellEnd"/>
+            <w:r>
+              <w:rPr>
+                <w:bCs/>
+                <w:i/>
+                <w:iCs/>
+                <w:color w:val="000000" w:themeColor="text1"/>
+                <w:sz w:val="22"/>
+                <w:szCs w:val="22"/>
+                <w:lang w:eastAsia="en-US"/>
+              </w:rPr>
+              <w:t xml:space="preserve"> </w:t>
+            </w:r>
+            <w:proofErr w:type="spellStart"/>
+            <w:r>
+              <w:rPr>
+                <w:bCs/>
+                <w:i/>
+                <w:iCs/>
+                <w:color w:val="000000" w:themeColor="text1"/>
+                <w:sz w:val="22"/>
+                <w:szCs w:val="22"/>
+                <w:lang w:eastAsia="en-US"/>
+              </w:rPr>
+              <w:t>ini</w:t>
+            </w:r>
+            <w:proofErr w:type="spellEnd"/>
           </w:p>
         </w:tc>
       </w:tr>
@@ -682,13 +1736,29 @@
               <w:rPr>
                 <w:color w:val="000000" w:themeColor="text1"/>
               </w:rPr>
-              <w:t>…………………….</w:t>
-            </w:r>
-            <w:r>
-              <w:rPr>
-                <w:color w:val="000000" w:themeColor="text1"/>
-              </w:rPr>
-              <w:t>dst.</w:t>
+              <w:t>…………………</w:t>
+            </w:r>
+            <w:proofErr w:type="gramStart"/>
+            <w:r>
+              <w:rPr>
+                <w:color w:val="000000" w:themeColor="text1"/>
+              </w:rPr>
+              <w:t>….</w:t>
+            </w:r>
+            <w:proofErr w:type="spellStart"/>
+            <w:r>
+              <w:rPr>
+                <w:color w:val="000000" w:themeColor="text1"/>
+              </w:rPr>
+              <w:t>dst</w:t>
+            </w:r>
+            <w:proofErr w:type="spellEnd"/>
+            <w:proofErr w:type="gramEnd"/>
+            <w:r>
+              <w:rPr>
+                <w:color w:val="000000" w:themeColor="text1"/>
+              </w:rPr>
+              <w:t>.</w:t>
             </w:r>
           </w:p>
         </w:tc>
@@ -724,8 +1794,54 @@
                 <w:color w:val="000000" w:themeColor="text1"/>
                 <w:lang w:eastAsia="en-US"/>
               </w:rPr>
-              <w:t>D.2. Pendekatan Pemecahan Masalah</w:t>
-            </w:r>
+              <w:t xml:space="preserve">D.2. </w:t>
+            </w:r>
+            <w:proofErr w:type="spellStart"/>
+            <w:r>
+              <w:rPr>
+                <w:b/>
+                <w:color w:val="000000" w:themeColor="text1"/>
+                <w:lang w:eastAsia="en-US"/>
+              </w:rPr>
+              <w:t>Pendekatan</w:t>
+            </w:r>
+            <w:proofErr w:type="spellEnd"/>
+            <w:r>
+              <w:rPr>
+                <w:b/>
+                <w:color w:val="000000" w:themeColor="text1"/>
+                <w:lang w:eastAsia="en-US"/>
+              </w:rPr>
+              <w:t xml:space="preserve"> </w:t>
+            </w:r>
+            <w:proofErr w:type="spellStart"/>
+            <w:r>
+              <w:rPr>
+                <w:b/>
+                <w:color w:val="000000" w:themeColor="text1"/>
+                <w:lang w:eastAsia="en-US"/>
+              </w:rPr>
+              <w:t>Pemecahan</w:t>
+            </w:r>
+            <w:proofErr w:type="spellEnd"/>
+            <w:r>
+              <w:rPr>
+                <w:b/>
+                <w:color w:val="000000" w:themeColor="text1"/>
+                <w:lang w:eastAsia="en-US"/>
+              </w:rPr>
+              <w:t xml:space="preserve"> </w:t>
+            </w:r>
+            <w:proofErr w:type="spellStart"/>
+            <w:r>
+              <w:rPr>
+                <w:b/>
+                <w:color w:val="000000" w:themeColor="text1"/>
+                <w:lang w:eastAsia="en-US"/>
+              </w:rPr>
+              <w:t>Masalah</w:t>
+            </w:r>
+            <w:proofErr w:type="spellEnd"/>
           </w:p>
           <w:p>
             <w:pPr>
@@ -747,18 +1863,150 @@
                 <w:lang w:eastAsia="en-US"/>
               </w:rPr>
             </w:pPr>
-            <w:r>
-              <w:rPr>
-                <w:bCs/>
-                <w:i/>
-                <w:iCs/>
-                <w:color w:val="000000" w:themeColor="text1"/>
-                <w:sz w:val="22"/>
-                <w:szCs w:val="22"/>
-                <w:lang w:eastAsia="en-US"/>
-              </w:rPr>
-              <w:t>Tuliskan pendekatan dan strategi pemecahan masalah yang telah dirumuskan</w:t>
-            </w:r>
+            <w:proofErr w:type="spellStart"/>
+            <w:r>
+              <w:rPr>
+                <w:bCs/>
+                <w:i/>
+                <w:iCs/>
+                <w:color w:val="000000" w:themeColor="text1"/>
+                <w:sz w:val="22"/>
+                <w:szCs w:val="22"/>
+                <w:lang w:eastAsia="en-US"/>
+              </w:rPr>
+              <w:t>Tuliskan</w:t>
+            </w:r>
+            <w:proofErr w:type="spellEnd"/>
+            <w:r>
+              <w:rPr>
+                <w:bCs/>
+                <w:i/>
+                <w:iCs/>
+                <w:color w:val="000000" w:themeColor="text1"/>
+                <w:sz w:val="22"/>
+                <w:szCs w:val="22"/>
+                <w:lang w:eastAsia="en-US"/>
+              </w:rPr>
+              <w:t xml:space="preserve"> </w:t>
+            </w:r>
+            <w:proofErr w:type="spellStart"/>
+            <w:r>
+              <w:rPr>
+                <w:bCs/>
+                <w:i/>
+                <w:iCs/>
+                <w:color w:val="000000" w:themeColor="text1"/>
+                <w:sz w:val="22"/>
+                <w:szCs w:val="22"/>
+                <w:lang w:eastAsia="en-US"/>
+              </w:rPr>
+              <w:t>pendekatan</w:t>
+            </w:r>
+            <w:proofErr w:type="spellEnd"/>
+            <w:r>
+              <w:rPr>
+                <w:bCs/>
+                <w:i/>
+                <w:iCs/>
+                <w:color w:val="000000" w:themeColor="text1"/>
+                <w:sz w:val="22"/>
+                <w:szCs w:val="22"/>
+                <w:lang w:eastAsia="en-US"/>
+              </w:rPr>
+              <w:t xml:space="preserve"> dan strategi </w:t>
+            </w:r>
+            <w:proofErr w:type="spellStart"/>
+            <w:r>
+              <w:rPr>
+                <w:bCs/>
+                <w:i/>
+                <w:iCs/>
+                <w:color w:val="000000" w:themeColor="text1"/>
+                <w:sz w:val="22"/>
+                <w:szCs w:val="22"/>
+                <w:lang w:eastAsia="en-US"/>
+              </w:rPr>
+              <w:t>pemecahan</w:t>
+            </w:r>
+            <w:proofErr w:type="spellEnd"/>
+            <w:r>
+              <w:rPr>
+                <w:bCs/>
+                <w:i/>
+                <w:iCs/>
+                <w:color w:val="000000" w:themeColor="text1"/>
+                <w:sz w:val="22"/>
+                <w:szCs w:val="22"/>
+                <w:lang w:eastAsia="en-US"/>
+              </w:rPr>
+              <w:t xml:space="preserve"> </w:t>
+            </w:r>
+            <w:proofErr w:type="spellStart"/>
+            <w:r>
+              <w:rPr>
+                <w:bCs/>
+                <w:i/>
+                <w:iCs/>
+                <w:color w:val="000000" w:themeColor="text1"/>
+                <w:sz w:val="22"/>
+                <w:szCs w:val="22"/>
+                <w:lang w:eastAsia="en-US"/>
+              </w:rPr>
+              <w:t>masalah</w:t>
+            </w:r>
+            <w:proofErr w:type="spellEnd"/>
+            <w:r>
+              <w:rPr>
+                <w:bCs/>
+                <w:i/>
+                <w:iCs/>
+                <w:color w:val="000000" w:themeColor="text1"/>
+                <w:sz w:val="22"/>
+                <w:szCs w:val="22"/>
+                <w:lang w:eastAsia="en-US"/>
+              </w:rPr>
+              <w:t xml:space="preserve"> yang </w:t>
+            </w:r>
+            <w:proofErr w:type="spellStart"/>
+            <w:r>
+              <w:rPr>
+                <w:bCs/>
+                <w:i/>
+                <w:iCs/>
+                <w:color w:val="000000" w:themeColor="text1"/>
+                <w:sz w:val="22"/>
+                <w:szCs w:val="22"/>
+                <w:lang w:eastAsia="en-US"/>
+              </w:rPr>
+              <w:t>telah</w:t>
+            </w:r>
+            <w:proofErr w:type="spellEnd"/>
+            <w:r>
+              <w:rPr>
+                <w:bCs/>
+                <w:i/>
+                <w:iCs/>
+                <w:color w:val="000000" w:themeColor="text1"/>
+                <w:sz w:val="22"/>
+                <w:szCs w:val="22"/>
+                <w:lang w:eastAsia="en-US"/>
+              </w:rPr>
+              <w:t xml:space="preserve"> </w:t>
+            </w:r>
+            <w:proofErr w:type="spellStart"/>
+            <w:r>
+              <w:rPr>
+                <w:bCs/>
+                <w:i/>
+                <w:iCs/>
+                <w:color w:val="000000" w:themeColor="text1"/>
+                <w:sz w:val="22"/>
+                <w:szCs w:val="22"/>
+                <w:lang w:eastAsia="en-US"/>
+              </w:rPr>
+              <w:t>dirumuskan</w:t>
+            </w:r>
+            <w:proofErr w:type="spellEnd"/>
           </w:p>
         </w:tc>
       </w:tr>
@@ -787,13 +2035,29 @@
               <w:rPr>
                 <w:color w:val="000000" w:themeColor="text1"/>
               </w:rPr>
-              <w:t>…………………….</w:t>
-            </w:r>
-            <w:r>
-              <w:rPr>
-                <w:color w:val="000000" w:themeColor="text1"/>
-              </w:rPr>
-              <w:t>dst.</w:t>
+              <w:t>…………………</w:t>
+            </w:r>
+            <w:proofErr w:type="gramStart"/>
+            <w:r>
+              <w:rPr>
+                <w:color w:val="000000" w:themeColor="text1"/>
+              </w:rPr>
+              <w:t>….</w:t>
+            </w:r>
+            <w:proofErr w:type="spellStart"/>
+            <w:r>
+              <w:rPr>
+                <w:color w:val="000000" w:themeColor="text1"/>
+              </w:rPr>
+              <w:t>dst</w:t>
+            </w:r>
+            <w:proofErr w:type="spellEnd"/>
+            <w:proofErr w:type="gramEnd"/>
+            <w:r>
+              <w:rPr>
+                <w:color w:val="000000" w:themeColor="text1"/>
+              </w:rPr>
+              <w:t>.</w:t>
             </w:r>
           </w:p>
         </w:tc>
@@ -831,8 +2095,18 @@
                 <w:color w:val="000000" w:themeColor="text1"/>
                 <w:lang w:eastAsia="en-US"/>
               </w:rPr>
-              <w:t>D.3. State of The Art dan Kebaruan</w:t>
-            </w:r>
+              <w:t xml:space="preserve">D.3. State of The Art dan </w:t>
+            </w:r>
+            <w:proofErr w:type="spellStart"/>
+            <w:r>
+              <w:rPr>
+                <w:b/>
+                <w:color w:val="000000" w:themeColor="text1"/>
+                <w:lang w:eastAsia="en-US"/>
+              </w:rPr>
+              <w:t>Kebaruan</w:t>
+            </w:r>
+            <w:proofErr w:type="spellEnd"/>
           </w:p>
           <w:p>
             <w:pPr>
@@ -856,6 +2130,7 @@
                 <w:lang w:eastAsia="en-US"/>
               </w:rPr>
             </w:pPr>
+            <w:proofErr w:type="spellStart"/>
             <w:r>
               <w:rPr>
                 <w:bCs/>
@@ -878,8 +2153,686 @@
                 <w:szCs w:val="22"/>
                 <w:lang w:eastAsia="en-US"/>
               </w:rPr>
-              <w:t>uliskan keunggulan dari pemecahan masalah yang ditawarkan pengusul dibandingkan dengan penelitian pengusul sebelumnya atau peneliti lainnya dalam konteks permasalahan yang sama, serta kebaruan usulan dari aspek pendekatan, metoda, dsb</w:t>
-            </w:r>
+              <w:t>uliskan</w:t>
+            </w:r>
+            <w:proofErr w:type="spellEnd"/>
+            <w:r>
+              <w:rPr>
+                <w:bCs/>
+                <w:i/>
+                <w:iCs/>
+                <w:color w:val="000000" w:themeColor="text1"/>
+                <w:sz w:val="22"/>
+                <w:szCs w:val="22"/>
+                <w:lang w:eastAsia="en-US"/>
+              </w:rPr>
+              <w:t xml:space="preserve"> </w:t>
+            </w:r>
+            <w:proofErr w:type="spellStart"/>
+            <w:r>
+              <w:rPr>
+                <w:bCs/>
+                <w:i/>
+                <w:iCs/>
+                <w:color w:val="000000" w:themeColor="text1"/>
+                <w:sz w:val="22"/>
+                <w:szCs w:val="22"/>
+                <w:lang w:eastAsia="en-US"/>
+              </w:rPr>
+              <w:t>keunggulan</w:t>
+            </w:r>
+            <w:proofErr w:type="spellEnd"/>
+            <w:r>
+              <w:rPr>
+                <w:bCs/>
+                <w:i/>
+                <w:iCs/>
+                <w:color w:val="000000" w:themeColor="text1"/>
+                <w:sz w:val="22"/>
+                <w:szCs w:val="22"/>
+                <w:lang w:eastAsia="en-US"/>
+              </w:rPr>
+              <w:t xml:space="preserve"> </w:t>
+            </w:r>
+            <w:proofErr w:type="spellStart"/>
+            <w:r>
+              <w:rPr>
+                <w:bCs/>
+                <w:i/>
+                <w:iCs/>
+                <w:color w:val="000000" w:themeColor="text1"/>
+                <w:sz w:val="22"/>
+                <w:szCs w:val="22"/>
+                <w:lang w:eastAsia="en-US"/>
+              </w:rPr>
+              <w:t>dari</w:t>
+            </w:r>
+            <w:proofErr w:type="spellEnd"/>
+            <w:r>
+              <w:rPr>
+                <w:bCs/>
+                <w:i/>
+                <w:iCs/>
+                <w:color w:val="000000" w:themeColor="text1"/>
+                <w:sz w:val="22"/>
+                <w:szCs w:val="22"/>
+                <w:lang w:eastAsia="en-US"/>
+              </w:rPr>
+              <w:t xml:space="preserve"> </w:t>
+            </w:r>
+            <w:proofErr w:type="spellStart"/>
+            <w:r>
+              <w:rPr>
+                <w:bCs/>
+                <w:i/>
+                <w:iCs/>
+                <w:color w:val="000000" w:themeColor="text1"/>
+                <w:sz w:val="22"/>
+                <w:szCs w:val="22"/>
+                <w:lang w:eastAsia="en-US"/>
+              </w:rPr>
+              <w:t>pemecahan</w:t>
+            </w:r>
+            <w:proofErr w:type="spellEnd"/>
+            <w:r>
+              <w:rPr>
+                <w:bCs/>
+                <w:i/>
+                <w:iCs/>
+                <w:color w:val="000000" w:themeColor="text1"/>
+                <w:sz w:val="22"/>
+                <w:szCs w:val="22"/>
+                <w:lang w:eastAsia="en-US"/>
+              </w:rPr>
+              <w:t xml:space="preserve"> </w:t>
+            </w:r>
+            <w:proofErr w:type="spellStart"/>
+            <w:r>
+              <w:rPr>
+                <w:bCs/>
+                <w:i/>
+                <w:iCs/>
+                <w:color w:val="000000" w:themeColor="text1"/>
+                <w:sz w:val="22"/>
+                <w:szCs w:val="22"/>
+                <w:lang w:eastAsia="en-US"/>
+              </w:rPr>
+              <w:t>masalah</w:t>
+            </w:r>
+            <w:proofErr w:type="spellEnd"/>
+            <w:r>
+              <w:rPr>
+                <w:bCs/>
+                <w:i/>
+                <w:iCs/>
+                <w:color w:val="000000" w:themeColor="text1"/>
+                <w:sz w:val="22"/>
+                <w:szCs w:val="22"/>
+                <w:lang w:eastAsia="en-US"/>
+              </w:rPr>
+              <w:t xml:space="preserve"> yang </w:t>
+            </w:r>
+            <w:proofErr w:type="spellStart"/>
+            <w:r>
+              <w:rPr>
+                <w:bCs/>
+                <w:i/>
+                <w:iCs/>
+                <w:color w:val="000000" w:themeColor="text1"/>
+                <w:sz w:val="22"/>
+                <w:szCs w:val="22"/>
+                <w:lang w:eastAsia="en-US"/>
+              </w:rPr>
+              <w:t>ditawarkan</w:t>
+            </w:r>
+            <w:proofErr w:type="spellEnd"/>
+            <w:r>
+              <w:rPr>
+                <w:bCs/>
+                <w:i/>
+                <w:iCs/>
+                <w:color w:val="000000" w:themeColor="text1"/>
+                <w:sz w:val="22"/>
+                <w:szCs w:val="22"/>
+                <w:lang w:eastAsia="en-US"/>
+              </w:rPr>
+              <w:t xml:space="preserve"> </w:t>
+            </w:r>
+            <w:proofErr w:type="spellStart"/>
+            <w:r>
+              <w:rPr>
+                <w:bCs/>
+                <w:i/>
+                <w:iCs/>
+                <w:color w:val="000000" w:themeColor="text1"/>
+                <w:sz w:val="22"/>
+                <w:szCs w:val="22"/>
+                <w:lang w:eastAsia="en-US"/>
+              </w:rPr>
+              <w:t>pengusul</w:t>
+            </w:r>
+            <w:proofErr w:type="spellEnd"/>
+            <w:r>
+              <w:rPr>
+                <w:bCs/>
+                <w:i/>
+                <w:iCs/>
+                <w:color w:val="000000" w:themeColor="text1"/>
+                <w:sz w:val="22"/>
+                <w:szCs w:val="22"/>
+                <w:lang w:eastAsia="en-US"/>
+              </w:rPr>
+              <w:t xml:space="preserve"> </w:t>
+            </w:r>
+            <w:proofErr w:type="spellStart"/>
+            <w:r>
+              <w:rPr>
+                <w:bCs/>
+                <w:i/>
+                <w:iCs/>
+                <w:color w:val="000000" w:themeColor="text1"/>
+                <w:sz w:val="22"/>
+                <w:szCs w:val="22"/>
+                <w:lang w:eastAsia="en-US"/>
+              </w:rPr>
+              <w:t>dibandingkan</w:t>
+            </w:r>
+            <w:proofErr w:type="spellEnd"/>
+            <w:r>
+              <w:rPr>
+                <w:bCs/>
+                <w:i/>
+                <w:iCs/>
+                <w:color w:val="000000" w:themeColor="text1"/>
+                <w:sz w:val="22"/>
+                <w:szCs w:val="22"/>
+                <w:lang w:eastAsia="en-US"/>
+              </w:rPr>
+              <w:t xml:space="preserve"> </w:t>
+            </w:r>
+            <w:proofErr w:type="spellStart"/>
+            <w:r>
+              <w:rPr>
+                <w:bCs/>
+                <w:i/>
+                <w:iCs/>
+                <w:color w:val="000000" w:themeColor="text1"/>
+                <w:sz w:val="22"/>
+                <w:szCs w:val="22"/>
+                <w:lang w:eastAsia="en-US"/>
+              </w:rPr>
+              <w:t>dengan</w:t>
+            </w:r>
+            <w:proofErr w:type="spellEnd"/>
+            <w:r>
+              <w:rPr>
+                <w:bCs/>
+                <w:i/>
+                <w:iCs/>
+                <w:color w:val="000000" w:themeColor="text1"/>
+                <w:sz w:val="22"/>
+                <w:szCs w:val="22"/>
+                <w:lang w:eastAsia="en-US"/>
+              </w:rPr>
+              <w:t xml:space="preserve"> </w:t>
+            </w:r>
+            <w:proofErr w:type="spellStart"/>
+            <w:r>
+              <w:rPr>
+                <w:bCs/>
+                <w:i/>
+                <w:iCs/>
+                <w:color w:val="000000" w:themeColor="text1"/>
+                <w:sz w:val="22"/>
+                <w:szCs w:val="22"/>
+                <w:lang w:eastAsia="en-US"/>
+              </w:rPr>
+              <w:t>penelitian</w:t>
+            </w:r>
+            <w:proofErr w:type="spellEnd"/>
+            <w:r>
+              <w:rPr>
+                <w:bCs/>
+                <w:i/>
+                <w:iCs/>
+                <w:color w:val="000000" w:themeColor="text1"/>
+                <w:sz w:val="22"/>
+                <w:szCs w:val="22"/>
+                <w:lang w:eastAsia="en-US"/>
+              </w:rPr>
+              <w:t xml:space="preserve"> </w:t>
+            </w:r>
+            <w:proofErr w:type="spellStart"/>
+            <w:r>
+              <w:rPr>
+                <w:bCs/>
+                <w:i/>
+                <w:iCs/>
+                <w:color w:val="000000" w:themeColor="text1"/>
+                <w:sz w:val="22"/>
+                <w:szCs w:val="22"/>
+                <w:lang w:eastAsia="en-US"/>
+              </w:rPr>
+              <w:t>pengusul</w:t>
+            </w:r>
+            <w:proofErr w:type="spellEnd"/>
+            <w:r>
+              <w:rPr>
+                <w:bCs/>
+                <w:i/>
+                <w:iCs/>
+                <w:color w:val="000000" w:themeColor="text1"/>
+                <w:sz w:val="22"/>
+                <w:szCs w:val="22"/>
+                <w:lang w:eastAsia="en-US"/>
+              </w:rPr>
+              <w:t xml:space="preserve"> </w:t>
+            </w:r>
+            <w:proofErr w:type="spellStart"/>
+            <w:r>
+              <w:rPr>
+                <w:bCs/>
+                <w:i/>
+                <w:iCs/>
+                <w:color w:val="000000" w:themeColor="text1"/>
+                <w:sz w:val="22"/>
+                <w:szCs w:val="22"/>
+                <w:lang w:eastAsia="en-US"/>
+              </w:rPr>
+              <w:t>sebelumnya</w:t>
+            </w:r>
+            <w:proofErr w:type="spellEnd"/>
+            <w:r>
+              <w:rPr>
+                <w:bCs/>
+                <w:i/>
+                <w:iCs/>
+                <w:color w:val="000000" w:themeColor="text1"/>
+                <w:sz w:val="22"/>
+                <w:szCs w:val="22"/>
+                <w:lang w:eastAsia="en-US"/>
+              </w:rPr>
+              <w:t xml:space="preserve"> </w:t>
+            </w:r>
+            <w:proofErr w:type="spellStart"/>
+            <w:r>
+              <w:rPr>
+                <w:bCs/>
+                <w:i/>
+                <w:iCs/>
+                <w:color w:val="000000" w:themeColor="text1"/>
+                <w:sz w:val="22"/>
+                <w:szCs w:val="22"/>
+                <w:lang w:eastAsia="en-US"/>
+              </w:rPr>
+              <w:t>atau</w:t>
+            </w:r>
+            <w:proofErr w:type="spellEnd"/>
+            <w:r>
+              <w:rPr>
+                <w:bCs/>
+                <w:i/>
+                <w:iCs/>
+                <w:color w:val="000000" w:themeColor="text1"/>
+                <w:sz w:val="22"/>
+                <w:szCs w:val="22"/>
+                <w:lang w:eastAsia="en-US"/>
+              </w:rPr>
+              <w:t xml:space="preserve"> </w:t>
+            </w:r>
+            <w:proofErr w:type="spellStart"/>
+            <w:r>
+              <w:rPr>
+                <w:bCs/>
+                <w:i/>
+                <w:iCs/>
+                <w:color w:val="000000" w:themeColor="text1"/>
+                <w:sz w:val="22"/>
+                <w:szCs w:val="22"/>
+                <w:lang w:eastAsia="en-US"/>
+              </w:rPr>
+              <w:t>peneliti</w:t>
+            </w:r>
+            <w:proofErr w:type="spellEnd"/>
+            <w:r>
+              <w:rPr>
+                <w:bCs/>
+                <w:i/>
+                <w:iCs/>
+                <w:color w:val="000000" w:themeColor="text1"/>
+                <w:sz w:val="22"/>
+                <w:szCs w:val="22"/>
+                <w:lang w:eastAsia="en-US"/>
+              </w:rPr>
+              <w:t xml:space="preserve"> </w:t>
+            </w:r>
+            <w:proofErr w:type="spellStart"/>
+            <w:r>
+              <w:rPr>
+                <w:bCs/>
+                <w:i/>
+                <w:iCs/>
+                <w:color w:val="000000" w:themeColor="text1"/>
+                <w:sz w:val="22"/>
+                <w:szCs w:val="22"/>
+                <w:lang w:eastAsia="en-US"/>
+              </w:rPr>
+              <w:t>lainnya</w:t>
+            </w:r>
+            <w:proofErr w:type="spellEnd"/>
+            <w:r>
+              <w:rPr>
+                <w:bCs/>
+                <w:i/>
+                <w:iCs/>
+                <w:color w:val="000000" w:themeColor="text1"/>
+                <w:sz w:val="22"/>
+                <w:szCs w:val="22"/>
+                <w:lang w:eastAsia="en-US"/>
+              </w:rPr>
+              <w:t xml:space="preserve"> </w:t>
+            </w:r>
+            <w:proofErr w:type="spellStart"/>
+            <w:r>
+              <w:rPr>
+                <w:bCs/>
+                <w:i/>
+                <w:iCs/>
+                <w:color w:val="000000" w:themeColor="text1"/>
+                <w:sz w:val="22"/>
+                <w:szCs w:val="22"/>
+                <w:lang w:eastAsia="en-US"/>
+              </w:rPr>
+              <w:t>dalam</w:t>
+            </w:r>
+            <w:proofErr w:type="spellEnd"/>
+            <w:r>
+              <w:rPr>
+                <w:bCs/>
+                <w:i/>
+                <w:iCs/>
+                <w:color w:val="000000" w:themeColor="text1"/>
+                <w:sz w:val="22"/>
+                <w:szCs w:val="22"/>
+                <w:lang w:eastAsia="en-US"/>
+              </w:rPr>
+              <w:t xml:space="preserve"> </w:t>
+            </w:r>
+            <w:proofErr w:type="spellStart"/>
+            <w:r>
+              <w:rPr>
+                <w:bCs/>
+                <w:i/>
+                <w:iCs/>
+                <w:color w:val="000000" w:themeColor="text1"/>
+                <w:sz w:val="22"/>
+                <w:szCs w:val="22"/>
+                <w:lang w:eastAsia="en-US"/>
+              </w:rPr>
+              <w:t>konteks</w:t>
+            </w:r>
+            <w:proofErr w:type="spellEnd"/>
+            <w:r>
+              <w:rPr>
+                <w:bCs/>
+                <w:i/>
+                <w:iCs/>
+                <w:color w:val="000000" w:themeColor="text1"/>
+                <w:sz w:val="22"/>
+                <w:szCs w:val="22"/>
+                <w:lang w:eastAsia="en-US"/>
+              </w:rPr>
+              <w:t xml:space="preserve"> </w:t>
+            </w:r>
+            <w:proofErr w:type="spellStart"/>
+            <w:r>
+              <w:rPr>
+                <w:bCs/>
+                <w:i/>
+                <w:iCs/>
+                <w:color w:val="000000" w:themeColor="text1"/>
+                <w:sz w:val="22"/>
+                <w:szCs w:val="22"/>
+                <w:lang w:eastAsia="en-US"/>
+              </w:rPr>
+              <w:t>permasalahan</w:t>
+            </w:r>
+            <w:proofErr w:type="spellEnd"/>
+            <w:r>
+              <w:rPr>
+                <w:bCs/>
+                <w:i/>
+                <w:iCs/>
+                <w:color w:val="000000" w:themeColor="text1"/>
+                <w:sz w:val="22"/>
+                <w:szCs w:val="22"/>
+                <w:lang w:eastAsia="en-US"/>
+              </w:rPr>
+              <w:t xml:space="preserve"> yang </w:t>
+            </w:r>
+            <w:proofErr w:type="spellStart"/>
+            <w:r>
+              <w:rPr>
+                <w:bCs/>
+                <w:i/>
+                <w:iCs/>
+                <w:color w:val="000000" w:themeColor="text1"/>
+                <w:sz w:val="22"/>
+                <w:szCs w:val="22"/>
+                <w:lang w:eastAsia="en-US"/>
+              </w:rPr>
+              <w:t>sama</w:t>
+            </w:r>
+            <w:proofErr w:type="spellEnd"/>
+            <w:r>
+              <w:rPr>
+                <w:bCs/>
+                <w:i/>
+                <w:iCs/>
+                <w:color w:val="000000" w:themeColor="text1"/>
+                <w:sz w:val="22"/>
+                <w:szCs w:val="22"/>
+                <w:lang w:eastAsia="en-US"/>
+              </w:rPr>
+              <w:t xml:space="preserve">, </w:t>
+            </w:r>
+            <w:proofErr w:type="spellStart"/>
+            <w:r>
+              <w:rPr>
+                <w:bCs/>
+                <w:i/>
+                <w:iCs/>
+                <w:color w:val="000000" w:themeColor="text1"/>
+                <w:sz w:val="22"/>
+                <w:szCs w:val="22"/>
+                <w:lang w:eastAsia="en-US"/>
+              </w:rPr>
+              <w:t>serta</w:t>
+            </w:r>
+            <w:proofErr w:type="spellEnd"/>
+            <w:r>
+              <w:rPr>
+                <w:bCs/>
+                <w:i/>
+                <w:iCs/>
+                <w:color w:val="000000" w:themeColor="text1"/>
+                <w:sz w:val="22"/>
+                <w:szCs w:val="22"/>
+                <w:lang w:eastAsia="en-US"/>
+              </w:rPr>
+              <w:t xml:space="preserve"> </w:t>
+            </w:r>
+            <w:proofErr w:type="spellStart"/>
+            <w:r>
+              <w:rPr>
+                <w:bCs/>
+                <w:i/>
+                <w:iCs/>
+                <w:color w:val="000000" w:themeColor="text1"/>
+                <w:sz w:val="22"/>
+                <w:szCs w:val="22"/>
+                <w:lang w:eastAsia="en-US"/>
+              </w:rPr>
+              <w:lastRenderedPageBreak/>
+              <w:t>kebaruan</w:t>
+            </w:r>
+            <w:proofErr w:type="spellEnd"/>
+            <w:r>
+              <w:rPr>
+                <w:bCs/>
+                <w:i/>
+                <w:iCs/>
+                <w:color w:val="000000" w:themeColor="text1"/>
+                <w:sz w:val="22"/>
+                <w:szCs w:val="22"/>
+                <w:lang w:eastAsia="en-US"/>
+              </w:rPr>
+              <w:t xml:space="preserve"> </w:t>
+            </w:r>
+            <w:proofErr w:type="spellStart"/>
+            <w:r>
+              <w:rPr>
+                <w:bCs/>
+                <w:i/>
+                <w:iCs/>
+                <w:color w:val="000000" w:themeColor="text1"/>
+                <w:sz w:val="22"/>
+                <w:szCs w:val="22"/>
+                <w:lang w:eastAsia="en-US"/>
+              </w:rPr>
+              <w:t>usulan</w:t>
+            </w:r>
+            <w:proofErr w:type="spellEnd"/>
+            <w:r>
+              <w:rPr>
+                <w:bCs/>
+                <w:i/>
+                <w:iCs/>
+                <w:color w:val="000000" w:themeColor="text1"/>
+                <w:sz w:val="22"/>
+                <w:szCs w:val="22"/>
+                <w:lang w:eastAsia="en-US"/>
+              </w:rPr>
+              <w:t xml:space="preserve"> </w:t>
+            </w:r>
+            <w:proofErr w:type="spellStart"/>
+            <w:r>
+              <w:rPr>
+                <w:bCs/>
+                <w:i/>
+                <w:iCs/>
+                <w:color w:val="000000" w:themeColor="text1"/>
+                <w:sz w:val="22"/>
+                <w:szCs w:val="22"/>
+                <w:lang w:eastAsia="en-US"/>
+              </w:rPr>
+              <w:t>dari</w:t>
+            </w:r>
+            <w:proofErr w:type="spellEnd"/>
+            <w:r>
+              <w:rPr>
+                <w:bCs/>
+                <w:i/>
+                <w:iCs/>
+                <w:color w:val="000000" w:themeColor="text1"/>
+                <w:sz w:val="22"/>
+                <w:szCs w:val="22"/>
+                <w:lang w:eastAsia="en-US"/>
+              </w:rPr>
+              <w:t xml:space="preserve"> </w:t>
+            </w:r>
+            <w:proofErr w:type="spellStart"/>
+            <w:r>
+              <w:rPr>
+                <w:bCs/>
+                <w:i/>
+                <w:iCs/>
+                <w:color w:val="000000" w:themeColor="text1"/>
+                <w:sz w:val="22"/>
+                <w:szCs w:val="22"/>
+                <w:lang w:eastAsia="en-US"/>
+              </w:rPr>
+              <w:t>aspek</w:t>
+            </w:r>
+            <w:proofErr w:type="spellEnd"/>
+            <w:r>
+              <w:rPr>
+                <w:bCs/>
+                <w:i/>
+                <w:iCs/>
+                <w:color w:val="000000" w:themeColor="text1"/>
+                <w:sz w:val="22"/>
+                <w:szCs w:val="22"/>
+                <w:lang w:eastAsia="en-US"/>
+              </w:rPr>
+              <w:t xml:space="preserve"> </w:t>
+            </w:r>
+            <w:proofErr w:type="spellStart"/>
+            <w:r>
+              <w:rPr>
+                <w:bCs/>
+                <w:i/>
+                <w:iCs/>
+                <w:color w:val="000000" w:themeColor="text1"/>
+                <w:sz w:val="22"/>
+                <w:szCs w:val="22"/>
+                <w:lang w:eastAsia="en-US"/>
+              </w:rPr>
+              <w:t>pendekatan</w:t>
+            </w:r>
+            <w:proofErr w:type="spellEnd"/>
+            <w:r>
+              <w:rPr>
+                <w:bCs/>
+                <w:i/>
+                <w:iCs/>
+                <w:color w:val="000000" w:themeColor="text1"/>
+                <w:sz w:val="22"/>
+                <w:szCs w:val="22"/>
+                <w:lang w:eastAsia="en-US"/>
+              </w:rPr>
+              <w:t xml:space="preserve">, </w:t>
+            </w:r>
+            <w:proofErr w:type="spellStart"/>
+            <w:r>
+              <w:rPr>
+                <w:bCs/>
+                <w:i/>
+                <w:iCs/>
+                <w:color w:val="000000" w:themeColor="text1"/>
+                <w:sz w:val="22"/>
+                <w:szCs w:val="22"/>
+                <w:lang w:eastAsia="en-US"/>
+              </w:rPr>
+              <w:t>metoda</w:t>
+            </w:r>
+            <w:proofErr w:type="spellEnd"/>
+            <w:r>
+              <w:rPr>
+                <w:bCs/>
+                <w:i/>
+                <w:iCs/>
+                <w:color w:val="000000" w:themeColor="text1"/>
+                <w:sz w:val="22"/>
+                <w:szCs w:val="22"/>
+                <w:lang w:eastAsia="en-US"/>
+              </w:rPr>
+              <w:t xml:space="preserve">, </w:t>
+            </w:r>
+            <w:proofErr w:type="spellStart"/>
+            <w:r>
+              <w:rPr>
+                <w:bCs/>
+                <w:i/>
+                <w:iCs/>
+                <w:color w:val="000000" w:themeColor="text1"/>
+                <w:sz w:val="22"/>
+                <w:szCs w:val="22"/>
+                <w:lang w:eastAsia="en-US"/>
+              </w:rPr>
+              <w:t>dsb</w:t>
+            </w:r>
+            <w:proofErr w:type="spellEnd"/>
           </w:p>
         </w:tc>
       </w:tr>
@@ -909,13 +2862,29 @@
               <w:rPr>
                 <w:color w:val="000000" w:themeColor="text1"/>
               </w:rPr>
-              <w:t>…………………….</w:t>
-            </w:r>
-            <w:r>
-              <w:rPr>
-                <w:color w:val="000000" w:themeColor="text1"/>
-              </w:rPr>
-              <w:t>dst.</w:t>
+              <w:t>…………………</w:t>
+            </w:r>
+            <w:proofErr w:type="gramStart"/>
+            <w:r>
+              <w:rPr>
+                <w:color w:val="000000" w:themeColor="text1"/>
+              </w:rPr>
+              <w:t>….</w:t>
+            </w:r>
+            <w:proofErr w:type="spellStart"/>
+            <w:r>
+              <w:rPr>
+                <w:color w:val="000000" w:themeColor="text1"/>
+              </w:rPr>
+              <w:t>dst</w:t>
+            </w:r>
+            <w:proofErr w:type="spellEnd"/>
+            <w:proofErr w:type="gramEnd"/>
+            <w:r>
+              <w:rPr>
+                <w:color w:val="000000" w:themeColor="text1"/>
+              </w:rPr>
+              <w:t>.</w:t>
             </w:r>
           </w:p>
         </w:tc>
@@ -953,8 +2922,18 @@
                 <w:color w:val="000000" w:themeColor="text1"/>
                 <w:lang w:eastAsia="en-US"/>
               </w:rPr>
-              <w:t>D.4. Peta Jalan Penelitian</w:t>
-            </w:r>
+              <w:t xml:space="preserve">D.4. Peta Jalan </w:t>
+            </w:r>
+            <w:proofErr w:type="spellStart"/>
+            <w:r>
+              <w:rPr>
+                <w:b/>
+                <w:color w:val="000000" w:themeColor="text1"/>
+                <w:lang w:eastAsia="en-US"/>
+              </w:rPr>
+              <w:t>Penelitian</w:t>
+            </w:r>
+            <w:proofErr w:type="spellEnd"/>
           </w:p>
           <w:p>
             <w:pPr>
@@ -978,17 +2957,447 @@
                 <w:lang w:eastAsia="en-US"/>
               </w:rPr>
             </w:pPr>
-            <w:r>
-              <w:rPr>
-                <w:bCs/>
-                <w:i/>
-                <w:iCs/>
-                <w:color w:val="000000" w:themeColor="text1"/>
-                <w:sz w:val="22"/>
-                <w:szCs w:val="22"/>
-                <w:lang w:eastAsia="en-US"/>
-              </w:rPr>
-              <w:t>Tuliskan peta jalan penelitian dari tahapan yang telah dicapai, tahapan yang akan dilakukan selama jangka waktu penelitian, dan tahapan yang direncanakan.</w:t>
+            <w:proofErr w:type="spellStart"/>
+            <w:r>
+              <w:rPr>
+                <w:bCs/>
+                <w:i/>
+                <w:iCs/>
+                <w:color w:val="000000" w:themeColor="text1"/>
+                <w:sz w:val="22"/>
+                <w:szCs w:val="22"/>
+                <w:lang w:eastAsia="en-US"/>
+              </w:rPr>
+              <w:t>Tuliskan</w:t>
+            </w:r>
+            <w:proofErr w:type="spellEnd"/>
+            <w:r>
+              <w:rPr>
+                <w:bCs/>
+                <w:i/>
+                <w:iCs/>
+                <w:color w:val="000000" w:themeColor="text1"/>
+                <w:sz w:val="22"/>
+                <w:szCs w:val="22"/>
+                <w:lang w:eastAsia="en-US"/>
+              </w:rPr>
+              <w:t xml:space="preserve"> </w:t>
+            </w:r>
+            <w:proofErr w:type="spellStart"/>
+            <w:r>
+              <w:rPr>
+                <w:bCs/>
+                <w:i/>
+                <w:iCs/>
+                <w:color w:val="000000" w:themeColor="text1"/>
+                <w:sz w:val="22"/>
+                <w:szCs w:val="22"/>
+                <w:lang w:eastAsia="en-US"/>
+              </w:rPr>
+              <w:t>peta</w:t>
+            </w:r>
+            <w:proofErr w:type="spellEnd"/>
+            <w:r>
+              <w:rPr>
+                <w:bCs/>
+                <w:i/>
+                <w:iCs/>
+                <w:color w:val="000000" w:themeColor="text1"/>
+                <w:sz w:val="22"/>
+                <w:szCs w:val="22"/>
+                <w:lang w:eastAsia="en-US"/>
+              </w:rPr>
+              <w:t xml:space="preserve"> </w:t>
+            </w:r>
+            <w:proofErr w:type="spellStart"/>
+            <w:r>
+              <w:rPr>
+                <w:bCs/>
+                <w:i/>
+                <w:iCs/>
+                <w:color w:val="000000" w:themeColor="text1"/>
+                <w:sz w:val="22"/>
+                <w:szCs w:val="22"/>
+                <w:lang w:eastAsia="en-US"/>
+              </w:rPr>
+              <w:t>jalan</w:t>
+            </w:r>
+            <w:proofErr w:type="spellEnd"/>
+            <w:r>
+              <w:rPr>
+                <w:bCs/>
+                <w:i/>
+                <w:iCs/>
+                <w:color w:val="000000" w:themeColor="text1"/>
+                <w:sz w:val="22"/>
+                <w:szCs w:val="22"/>
+                <w:lang w:eastAsia="en-US"/>
+              </w:rPr>
+              <w:t xml:space="preserve"> </w:t>
+            </w:r>
+            <w:proofErr w:type="spellStart"/>
+            <w:r>
+              <w:rPr>
+                <w:bCs/>
+                <w:i/>
+                <w:iCs/>
+                <w:color w:val="000000" w:themeColor="text1"/>
+                <w:sz w:val="22"/>
+                <w:szCs w:val="22"/>
+                <w:lang w:eastAsia="en-US"/>
+              </w:rPr>
+              <w:t>penelitian</w:t>
+            </w:r>
+            <w:proofErr w:type="spellEnd"/>
+            <w:r>
+              <w:rPr>
+                <w:bCs/>
+                <w:i/>
+                <w:iCs/>
+                <w:color w:val="000000" w:themeColor="text1"/>
+                <w:sz w:val="22"/>
+                <w:szCs w:val="22"/>
+                <w:lang w:eastAsia="en-US"/>
+              </w:rPr>
+              <w:t xml:space="preserve"> </w:t>
+            </w:r>
+            <w:proofErr w:type="spellStart"/>
+            <w:r>
+              <w:rPr>
+                <w:bCs/>
+                <w:i/>
+                <w:iCs/>
+                <w:color w:val="000000" w:themeColor="text1"/>
+                <w:sz w:val="22"/>
+                <w:szCs w:val="22"/>
+                <w:lang w:eastAsia="en-US"/>
+              </w:rPr>
+              <w:t>dari</w:t>
+            </w:r>
+            <w:proofErr w:type="spellEnd"/>
+            <w:r>
+              <w:rPr>
+                <w:bCs/>
+                <w:i/>
+                <w:iCs/>
+                <w:color w:val="000000" w:themeColor="text1"/>
+                <w:sz w:val="22"/>
+                <w:szCs w:val="22"/>
+                <w:lang w:eastAsia="en-US"/>
+              </w:rPr>
+              <w:t xml:space="preserve"> </w:t>
+            </w:r>
+            <w:proofErr w:type="spellStart"/>
+            <w:r>
+              <w:rPr>
+                <w:bCs/>
+                <w:i/>
+                <w:iCs/>
+                <w:color w:val="000000" w:themeColor="text1"/>
+                <w:sz w:val="22"/>
+                <w:szCs w:val="22"/>
+                <w:lang w:eastAsia="en-US"/>
+              </w:rPr>
+              <w:t>tahapan</w:t>
+            </w:r>
+            <w:proofErr w:type="spellEnd"/>
+            <w:r>
+              <w:rPr>
+                <w:bCs/>
+                <w:i/>
+                <w:iCs/>
+                <w:color w:val="000000" w:themeColor="text1"/>
+                <w:sz w:val="22"/>
+                <w:szCs w:val="22"/>
+                <w:lang w:eastAsia="en-US"/>
+              </w:rPr>
+              <w:t xml:space="preserve"> yang </w:t>
+            </w:r>
+            <w:proofErr w:type="spellStart"/>
+            <w:r>
+              <w:rPr>
+                <w:bCs/>
+                <w:i/>
+                <w:iCs/>
+                <w:color w:val="000000" w:themeColor="text1"/>
+                <w:sz w:val="22"/>
+                <w:szCs w:val="22"/>
+                <w:lang w:eastAsia="en-US"/>
+              </w:rPr>
+              <w:t>telah</w:t>
+            </w:r>
+            <w:proofErr w:type="spellEnd"/>
+            <w:r>
+              <w:rPr>
+                <w:bCs/>
+                <w:i/>
+                <w:iCs/>
+                <w:color w:val="000000" w:themeColor="text1"/>
+                <w:sz w:val="22"/>
+                <w:szCs w:val="22"/>
+                <w:lang w:eastAsia="en-US"/>
+              </w:rPr>
+              <w:t xml:space="preserve"> </w:t>
+            </w:r>
+            <w:proofErr w:type="spellStart"/>
+            <w:r>
+              <w:rPr>
+                <w:bCs/>
+                <w:i/>
+                <w:iCs/>
+                <w:color w:val="000000" w:themeColor="text1"/>
+                <w:sz w:val="22"/>
+                <w:szCs w:val="22"/>
+                <w:lang w:eastAsia="en-US"/>
+              </w:rPr>
+              <w:t>dicapai</w:t>
+            </w:r>
+            <w:proofErr w:type="spellEnd"/>
+            <w:r>
+              <w:rPr>
+                <w:bCs/>
+                <w:i/>
+                <w:iCs/>
+                <w:color w:val="000000" w:themeColor="text1"/>
+                <w:sz w:val="22"/>
+                <w:szCs w:val="22"/>
+                <w:lang w:eastAsia="en-US"/>
+              </w:rPr>
+              <w:t xml:space="preserve">, </w:t>
+            </w:r>
+            <w:proofErr w:type="spellStart"/>
+            <w:r>
+              <w:rPr>
+                <w:bCs/>
+                <w:i/>
+                <w:iCs/>
+                <w:color w:val="000000" w:themeColor="text1"/>
+                <w:sz w:val="22"/>
+                <w:szCs w:val="22"/>
+                <w:lang w:eastAsia="en-US"/>
+              </w:rPr>
+              <w:t>tahapan</w:t>
+            </w:r>
+            <w:proofErr w:type="spellEnd"/>
+            <w:r>
+              <w:rPr>
+                <w:bCs/>
+                <w:i/>
+                <w:iCs/>
+                <w:color w:val="000000" w:themeColor="text1"/>
+                <w:sz w:val="22"/>
+                <w:szCs w:val="22"/>
+                <w:lang w:eastAsia="en-US"/>
+              </w:rPr>
+              <w:t xml:space="preserve"> yang </w:t>
+            </w:r>
+            <w:proofErr w:type="spellStart"/>
+            <w:r>
+              <w:rPr>
+                <w:bCs/>
+                <w:i/>
+                <w:iCs/>
+                <w:color w:val="000000" w:themeColor="text1"/>
+                <w:sz w:val="22"/>
+                <w:szCs w:val="22"/>
+                <w:lang w:eastAsia="en-US"/>
+              </w:rPr>
+              <w:t>akan</w:t>
+            </w:r>
+            <w:proofErr w:type="spellEnd"/>
+            <w:r>
+              <w:rPr>
+                <w:bCs/>
+                <w:i/>
+                <w:iCs/>
+                <w:color w:val="000000" w:themeColor="text1"/>
+                <w:sz w:val="22"/>
+                <w:szCs w:val="22"/>
+                <w:lang w:eastAsia="en-US"/>
+              </w:rPr>
+              <w:t xml:space="preserve"> </w:t>
+            </w:r>
+            <w:proofErr w:type="spellStart"/>
+            <w:r>
+              <w:rPr>
+                <w:bCs/>
+                <w:i/>
+                <w:iCs/>
+                <w:color w:val="000000" w:themeColor="text1"/>
+                <w:sz w:val="22"/>
+                <w:szCs w:val="22"/>
+                <w:lang w:eastAsia="en-US"/>
+              </w:rPr>
+              <w:t>dilakukan</w:t>
+            </w:r>
+            <w:proofErr w:type="spellEnd"/>
+            <w:r>
+              <w:rPr>
+                <w:bCs/>
+                <w:i/>
+                <w:iCs/>
+                <w:color w:val="000000" w:themeColor="text1"/>
+                <w:sz w:val="22"/>
+                <w:szCs w:val="22"/>
+                <w:lang w:eastAsia="en-US"/>
+              </w:rPr>
+              <w:t xml:space="preserve"> </w:t>
+            </w:r>
+            <w:proofErr w:type="spellStart"/>
+            <w:r>
+              <w:rPr>
+                <w:bCs/>
+                <w:i/>
+                <w:iCs/>
+                <w:color w:val="000000" w:themeColor="text1"/>
+                <w:sz w:val="22"/>
+                <w:szCs w:val="22"/>
+                <w:lang w:eastAsia="en-US"/>
+              </w:rPr>
+              <w:t>selama</w:t>
+            </w:r>
+            <w:proofErr w:type="spellEnd"/>
+            <w:r>
+              <w:rPr>
+                <w:bCs/>
+                <w:i/>
+                <w:iCs/>
+                <w:color w:val="000000" w:themeColor="text1"/>
+                <w:sz w:val="22"/>
+                <w:szCs w:val="22"/>
+                <w:lang w:eastAsia="en-US"/>
+              </w:rPr>
+              <w:t xml:space="preserve"> </w:t>
+            </w:r>
+            <w:proofErr w:type="spellStart"/>
+            <w:r>
+              <w:rPr>
+                <w:bCs/>
+                <w:i/>
+                <w:iCs/>
+                <w:color w:val="000000" w:themeColor="text1"/>
+                <w:sz w:val="22"/>
+                <w:szCs w:val="22"/>
+                <w:lang w:eastAsia="en-US"/>
+              </w:rPr>
+              <w:t>jangka</w:t>
+            </w:r>
+            <w:proofErr w:type="spellEnd"/>
+            <w:r>
+              <w:rPr>
+                <w:bCs/>
+                <w:i/>
+                <w:iCs/>
+                <w:color w:val="000000" w:themeColor="text1"/>
+                <w:sz w:val="22"/>
+                <w:szCs w:val="22"/>
+                <w:lang w:eastAsia="en-US"/>
+              </w:rPr>
+              <w:t xml:space="preserve"> </w:t>
+            </w:r>
+            <w:proofErr w:type="spellStart"/>
+            <w:r>
+              <w:rPr>
+                <w:bCs/>
+                <w:i/>
+                <w:iCs/>
+                <w:color w:val="000000" w:themeColor="text1"/>
+                <w:sz w:val="22"/>
+                <w:szCs w:val="22"/>
+                <w:lang w:eastAsia="en-US"/>
+              </w:rPr>
+              <w:t>waktu</w:t>
+            </w:r>
+            <w:proofErr w:type="spellEnd"/>
+            <w:r>
+              <w:rPr>
+                <w:bCs/>
+                <w:i/>
+                <w:iCs/>
+                <w:color w:val="000000" w:themeColor="text1"/>
+                <w:sz w:val="22"/>
+                <w:szCs w:val="22"/>
+                <w:lang w:eastAsia="en-US"/>
+              </w:rPr>
+              <w:t xml:space="preserve"> </w:t>
+            </w:r>
+            <w:proofErr w:type="spellStart"/>
+            <w:r>
+              <w:rPr>
+                <w:bCs/>
+                <w:i/>
+                <w:iCs/>
+                <w:color w:val="000000" w:themeColor="text1"/>
+                <w:sz w:val="22"/>
+                <w:szCs w:val="22"/>
+                <w:lang w:eastAsia="en-US"/>
+              </w:rPr>
+              <w:t>penelitian</w:t>
+            </w:r>
+            <w:proofErr w:type="spellEnd"/>
+            <w:r>
+              <w:rPr>
+                <w:bCs/>
+                <w:i/>
+                <w:iCs/>
+                <w:color w:val="000000" w:themeColor="text1"/>
+                <w:sz w:val="22"/>
+                <w:szCs w:val="22"/>
+                <w:lang w:eastAsia="en-US"/>
+              </w:rPr>
+              <w:t xml:space="preserve">, dan </w:t>
+            </w:r>
+            <w:proofErr w:type="spellStart"/>
+            <w:r>
+              <w:rPr>
+                <w:bCs/>
+                <w:i/>
+                <w:iCs/>
+                <w:color w:val="000000" w:themeColor="text1"/>
+                <w:sz w:val="22"/>
+                <w:szCs w:val="22"/>
+                <w:lang w:eastAsia="en-US"/>
+              </w:rPr>
+              <w:t>tahapan</w:t>
+            </w:r>
+            <w:proofErr w:type="spellEnd"/>
+            <w:r>
+              <w:rPr>
+                <w:bCs/>
+                <w:i/>
+                <w:iCs/>
+                <w:color w:val="000000" w:themeColor="text1"/>
+                <w:sz w:val="22"/>
+                <w:szCs w:val="22"/>
+                <w:lang w:eastAsia="en-US"/>
+              </w:rPr>
+              <w:t xml:space="preserve"> yang </w:t>
+            </w:r>
+            <w:proofErr w:type="spellStart"/>
+            <w:r>
+              <w:rPr>
+                <w:bCs/>
+                <w:i/>
+                <w:iCs/>
+                <w:color w:val="000000" w:themeColor="text1"/>
+                <w:sz w:val="22"/>
+                <w:szCs w:val="22"/>
+                <w:lang w:eastAsia="en-US"/>
+              </w:rPr>
+              <w:t>direncanakan</w:t>
+            </w:r>
+            <w:proofErr w:type="spellEnd"/>
+            <w:r>
+              <w:rPr>
+                <w:bCs/>
+                <w:i/>
+                <w:iCs/>
+                <w:color w:val="000000" w:themeColor="text1"/>
+                <w:sz w:val="22"/>
+                <w:szCs w:val="22"/>
+                <w:lang w:eastAsia="en-US"/>
+              </w:rPr>
+              <w:t>.</w:t>
             </w:r>
           </w:p>
         </w:tc>
@@ -1012,7 +3421,21 @@
               <w:rPr>
                 <w:color w:val="000000" w:themeColor="text1"/>
               </w:rPr>
-              <w:t>…………………………………………………………………………………………………………………………………………………………………………………………………………………………………………………………………………………………………………. dst.</w:t>
+              <w:t xml:space="preserve">…………………………………………………………………………………………………………………………………………………………………………………………………………………………………………………………………………………………………………. </w:t>
+            </w:r>
+            <w:proofErr w:type="spellStart"/>
+            <w:r>
+              <w:rPr>
+                <w:color w:val="000000" w:themeColor="text1"/>
+              </w:rPr>
+              <w:t>dst</w:t>
+            </w:r>
+            <w:proofErr w:type="spellEnd"/>
+            <w:r>
+              <w:rPr>
+                <w:color w:val="000000" w:themeColor="text1"/>
+              </w:rPr>
+              <w:t>.</w:t>
             </w:r>
           </w:p>
         </w:tc>
@@ -1089,12 +3512,277 @@
                 <w:lang w:eastAsia="en-US"/>
               </w:rPr>
             </w:pPr>
-            <w:r>
-              <w:rPr>
-                <w:color w:val="000000" w:themeColor="text1"/>
-                <w:lang w:eastAsia="en-US"/>
-              </w:rPr>
-              <w:t>sian metoda atau cara untuk mencapai tujuan yang telah ditetapkan tidak lebih dari 1000 kata. Pada bagian metoda wajib dilengkapi dengan:</w:t>
+            <w:proofErr w:type="spellStart"/>
+            <w:r>
+              <w:rPr>
+                <w:color w:val="000000" w:themeColor="text1"/>
+                <w:lang w:eastAsia="en-US"/>
+              </w:rPr>
+              <w:t>sian</w:t>
+            </w:r>
+            <w:proofErr w:type="spellEnd"/>
+            <w:r>
+              <w:rPr>
+                <w:color w:val="000000" w:themeColor="text1"/>
+                <w:lang w:eastAsia="en-US"/>
+              </w:rPr>
+              <w:t xml:space="preserve"> </w:t>
+            </w:r>
+            <w:proofErr w:type="spellStart"/>
+            <w:r>
+              <w:rPr>
+                <w:color w:val="000000" w:themeColor="text1"/>
+                <w:lang w:eastAsia="en-US"/>
+              </w:rPr>
+              <w:t>metoda</w:t>
+            </w:r>
+            <w:proofErr w:type="spellEnd"/>
+            <w:r>
+              <w:rPr>
+                <w:color w:val="000000" w:themeColor="text1"/>
+                <w:lang w:eastAsia="en-US"/>
+              </w:rPr>
+              <w:t xml:space="preserve"> </w:t>
+            </w:r>
+            <w:proofErr w:type="spellStart"/>
+            <w:r>
+              <w:rPr>
+                <w:color w:val="000000" w:themeColor="text1"/>
+                <w:lang w:eastAsia="en-US"/>
+              </w:rPr>
+              <w:t>atau</w:t>
+            </w:r>
+            <w:proofErr w:type="spellEnd"/>
+            <w:r>
+              <w:rPr>
+                <w:color w:val="000000" w:themeColor="text1"/>
+                <w:lang w:eastAsia="en-US"/>
+              </w:rPr>
+              <w:t xml:space="preserve"> </w:t>
+            </w:r>
+            <w:proofErr w:type="spellStart"/>
+            <w:r>
+              <w:rPr>
+                <w:color w:val="000000" w:themeColor="text1"/>
+                <w:lang w:eastAsia="en-US"/>
+              </w:rPr>
+              <w:t>cara</w:t>
+            </w:r>
+            <w:proofErr w:type="spellEnd"/>
+            <w:r>
+              <w:rPr>
+                <w:color w:val="000000" w:themeColor="text1"/>
+                <w:lang w:eastAsia="en-US"/>
+              </w:rPr>
+              <w:t xml:space="preserve"> </w:t>
+            </w:r>
+            <w:proofErr w:type="spellStart"/>
+            <w:r>
+              <w:rPr>
+                <w:color w:val="000000" w:themeColor="text1"/>
+                <w:lang w:eastAsia="en-US"/>
+              </w:rPr>
+              <w:t>untuk</w:t>
+            </w:r>
+            <w:proofErr w:type="spellEnd"/>
+            <w:r>
+              <w:rPr>
+                <w:color w:val="000000" w:themeColor="text1"/>
+                <w:lang w:eastAsia="en-US"/>
+              </w:rPr>
+              <w:t xml:space="preserve"> </w:t>
+            </w:r>
+            <w:proofErr w:type="spellStart"/>
+            <w:r>
+              <w:rPr>
+                <w:color w:val="000000" w:themeColor="text1"/>
+                <w:lang w:eastAsia="en-US"/>
+              </w:rPr>
+              <w:t>mencapai</w:t>
+            </w:r>
+            <w:proofErr w:type="spellEnd"/>
+            <w:r>
+              <w:rPr>
+                <w:color w:val="000000" w:themeColor="text1"/>
+                <w:lang w:eastAsia="en-US"/>
+              </w:rPr>
+              <w:t xml:space="preserve"> </w:t>
+            </w:r>
+            <w:proofErr w:type="spellStart"/>
+            <w:r>
+              <w:rPr>
+                <w:color w:val="000000" w:themeColor="text1"/>
+                <w:lang w:eastAsia="en-US"/>
+              </w:rPr>
+              <w:t>tujuan</w:t>
+            </w:r>
+            <w:proofErr w:type="spellEnd"/>
+            <w:r>
+              <w:rPr>
+                <w:color w:val="000000" w:themeColor="text1"/>
+                <w:lang w:eastAsia="en-US"/>
+              </w:rPr>
+              <w:t xml:space="preserve"> yang </w:t>
+            </w:r>
+            <w:proofErr w:type="spellStart"/>
+            <w:r>
+              <w:rPr>
+                <w:color w:val="000000" w:themeColor="text1"/>
+                <w:lang w:eastAsia="en-US"/>
+              </w:rPr>
+              <w:t>telah</w:t>
+            </w:r>
+            <w:proofErr w:type="spellEnd"/>
+            <w:r>
+              <w:rPr>
+                <w:color w:val="000000" w:themeColor="text1"/>
+                <w:lang w:eastAsia="en-US"/>
+              </w:rPr>
+              <w:t xml:space="preserve"> </w:t>
+            </w:r>
+            <w:proofErr w:type="spellStart"/>
+            <w:r>
+              <w:rPr>
+                <w:color w:val="000000" w:themeColor="text1"/>
+                <w:lang w:eastAsia="en-US"/>
+              </w:rPr>
+              <w:t>ditetapkan</w:t>
+            </w:r>
+            <w:proofErr w:type="spellEnd"/>
+            <w:r>
+              <w:rPr>
+                <w:color w:val="000000" w:themeColor="text1"/>
+                <w:lang w:eastAsia="en-US"/>
+              </w:rPr>
+              <w:t xml:space="preserve"> </w:t>
+            </w:r>
+            <w:proofErr w:type="spellStart"/>
+            <w:r>
+              <w:rPr>
+                <w:color w:val="000000" w:themeColor="text1"/>
+                <w:lang w:eastAsia="en-US"/>
+              </w:rPr>
+              <w:t>tidak</w:t>
+            </w:r>
+            <w:proofErr w:type="spellEnd"/>
+            <w:r>
+              <w:rPr>
+                <w:color w:val="000000" w:themeColor="text1"/>
+                <w:lang w:eastAsia="en-US"/>
+              </w:rPr>
+              <w:t xml:space="preserve"> </w:t>
+            </w:r>
+            <w:proofErr w:type="spellStart"/>
+            <w:r>
+              <w:rPr>
+                <w:color w:val="000000" w:themeColor="text1"/>
+                <w:lang w:eastAsia="en-US"/>
+              </w:rPr>
+              <w:t>lebih</w:t>
+            </w:r>
+            <w:proofErr w:type="spellEnd"/>
+            <w:r>
+              <w:rPr>
+                <w:color w:val="000000" w:themeColor="text1"/>
+                <w:lang w:eastAsia="en-US"/>
+              </w:rPr>
+              <w:t xml:space="preserve"> </w:t>
+            </w:r>
+            <w:proofErr w:type="spellStart"/>
+            <w:r>
+              <w:rPr>
+                <w:color w:val="000000" w:themeColor="text1"/>
+                <w:lang w:eastAsia="en-US"/>
+              </w:rPr>
+              <w:t>dari</w:t>
+            </w:r>
+            <w:proofErr w:type="spellEnd"/>
+            <w:r>
+              <w:rPr>
+                <w:color w:val="000000" w:themeColor="text1"/>
+                <w:lang w:eastAsia="en-US"/>
+              </w:rPr>
+              <w:t xml:space="preserve"> 1000 kata. Pada </w:t>
+            </w:r>
+            <w:proofErr w:type="spellStart"/>
+            <w:r>
+              <w:rPr>
+                <w:color w:val="000000" w:themeColor="text1"/>
+                <w:lang w:eastAsia="en-US"/>
+              </w:rPr>
+              <w:t>bagian</w:t>
+            </w:r>
+            <w:proofErr w:type="spellEnd"/>
+            <w:r>
+              <w:rPr>
+                <w:color w:val="000000" w:themeColor="text1"/>
+                <w:lang w:eastAsia="en-US"/>
+              </w:rPr>
+              <w:t xml:space="preserve"> </w:t>
+            </w:r>
+            <w:proofErr w:type="spellStart"/>
+            <w:r>
+              <w:rPr>
+                <w:color w:val="000000" w:themeColor="text1"/>
+                <w:lang w:eastAsia="en-US"/>
+              </w:rPr>
+              <w:t>metoda</w:t>
+            </w:r>
+            <w:proofErr w:type="spellEnd"/>
+            <w:r>
+              <w:rPr>
+                <w:color w:val="000000" w:themeColor="text1"/>
+                <w:lang w:eastAsia="en-US"/>
+              </w:rPr>
+              <w:t xml:space="preserve"> </w:t>
+            </w:r>
+            <w:proofErr w:type="spellStart"/>
+            <w:r>
+              <w:rPr>
+                <w:color w:val="000000" w:themeColor="text1"/>
+                <w:lang w:eastAsia="en-US"/>
+              </w:rPr>
+              <w:t>wajib</w:t>
+            </w:r>
+            <w:proofErr w:type="spellEnd"/>
+            <w:r>
+              <w:rPr>
+                <w:color w:val="000000" w:themeColor="text1"/>
+                <w:lang w:eastAsia="en-US"/>
+              </w:rPr>
+              <w:t xml:space="preserve"> </w:t>
+            </w:r>
+            <w:proofErr w:type="spellStart"/>
+            <w:r>
+              <w:rPr>
+                <w:color w:val="000000" w:themeColor="text1"/>
+                <w:lang w:eastAsia="en-US"/>
+              </w:rPr>
+              <w:t>dilengkapi</w:t>
+            </w:r>
+            <w:proofErr w:type="spellEnd"/>
+            <w:r>
+              <w:rPr>
+                <w:color w:val="000000" w:themeColor="text1"/>
+                <w:lang w:eastAsia="en-US"/>
+              </w:rPr>
+              <w:t xml:space="preserve"> </w:t>
+            </w:r>
+            <w:proofErr w:type="spellStart"/>
+            <w:r>
+              <w:rPr>
+                <w:color w:val="000000" w:themeColor="text1"/>
+                <w:lang w:eastAsia="en-US"/>
+              </w:rPr>
+              <w:t>dengan</w:t>
+            </w:r>
+            <w:proofErr w:type="spellEnd"/>
+            <w:r>
+              <w:rPr>
+                <w:color w:val="000000" w:themeColor="text1"/>
+                <w:lang w:eastAsia="en-US"/>
+              </w:rPr>
+              <w:t>:</w:t>
             </w:r>
             <w:r>
               <w:rPr>
@@ -1129,7 +3817,23 @@
                 <w:color w:val="000000" w:themeColor="text1"/>
                 <w:lang w:eastAsia="en-US"/>
               </w:rPr>
-              <w:t xml:space="preserve">Diagram alir penelitian yang menggambarkan apa yang sudah dilaksanakan dan yang akan dikerjakan selama waktu yang diusulkan. Format diagram alir dapat berupa file JPG/PNG. </w:t>
+              <w:t xml:space="preserve">Diagram alir penelitian yang menggambarkan apa yang sudah dilaksanakan dan yang akan dikerjakan selama waktu yang diusulkan. Format diagram alir dapat berupa </w:t>
+            </w:r>
+            <w:proofErr w:type="spellStart"/>
+            <w:r>
+              <w:rPr>
+                <w:color w:val="000000" w:themeColor="text1"/>
+                <w:lang w:eastAsia="en-US"/>
+              </w:rPr>
+              <w:t>file</w:t>
+            </w:r>
+            <w:proofErr w:type="spellEnd"/>
+            <w:r>
+              <w:rPr>
+                <w:color w:val="000000" w:themeColor="text1"/>
+                <w:lang w:eastAsia="en-US"/>
+              </w:rPr>
+              <w:t xml:space="preserve"> JPG/PNG. </w:t>
             </w:r>
           </w:p>
           <w:p>
@@ -1221,7 +3925,21 @@
               <w:rPr>
                 <w:color w:val="000000" w:themeColor="text1"/>
               </w:rPr>
-              <w:t>. dst.</w:t>
+              <w:t xml:space="preserve">. </w:t>
+            </w:r>
+            <w:proofErr w:type="spellStart"/>
+            <w:r>
+              <w:rPr>
+                <w:color w:val="000000" w:themeColor="text1"/>
+              </w:rPr>
+              <w:t>dst</w:t>
+            </w:r>
+            <w:proofErr w:type="spellEnd"/>
+            <w:r>
+              <w:rPr>
+                <w:color w:val="000000" w:themeColor="text1"/>
+              </w:rPr>
+              <w:t>.</w:t>
             </w:r>
           </w:p>
         </w:tc>
@@ -1368,6 +4086,7 @@
                       <w:lang w:eastAsia="en-US"/>
                     </w:rPr>
                   </w:pPr>
+                  <w:proofErr w:type="spellStart"/>
                   <w:r>
                     <w:rPr>
                       <w:rFonts w:asciiTheme="minorHAnsi" w:eastAsiaTheme="minorHAnsi" w:hAnsiTheme="minorHAnsi" w:cstheme="minorBidi"/>
@@ -1376,7 +4095,40 @@
                       <w:color w:val="000000" w:themeColor="text1"/>
                       <w:lang w:eastAsia="en-US"/>
                     </w:rPr>
-                    <w:t>Tahun Ke - 1</w:t>
+                    <w:t>Tahun</w:t>
+                  </w:r>
+                  <w:proofErr w:type="spellEnd"/>
+                  <w:r>
+                    <w:rPr>
+                      <w:rFonts w:asciiTheme="minorHAnsi" w:eastAsiaTheme="minorHAnsi" w:hAnsiTheme="minorHAnsi" w:cstheme="minorBidi"/>
+                      <w:b/>
+                      <w:i/>
+                      <w:color w:val="000000" w:themeColor="text1"/>
+                      <w:lang w:eastAsia="en-US"/>
+                    </w:rPr>
+                    <w:t xml:space="preserve"> </w:t>
+                  </w:r>
+                  <w:proofErr w:type="spellStart"/>
+                  <w:r>
+                    <w:rPr>
+                      <w:rFonts w:asciiTheme="minorHAnsi" w:eastAsiaTheme="minorHAnsi" w:hAnsiTheme="minorHAnsi" w:cstheme="minorBidi"/>
+                      <w:b/>
+                      <w:i/>
+                      <w:color w:val="000000" w:themeColor="text1"/>
+                      <w:lang w:eastAsia="en-US"/>
+                    </w:rPr>
+                    <w:t>Ke</w:t>
+                  </w:r>
+                  <w:proofErr w:type="spellEnd"/>
+                  <w:r>
+                    <w:rPr>
+                      <w:rFonts w:asciiTheme="minorHAnsi" w:eastAsiaTheme="minorHAnsi" w:hAnsiTheme="minorHAnsi" w:cstheme="minorBidi"/>
+                      <w:b/>
+                      <w:i/>
+                      <w:color w:val="000000" w:themeColor="text1"/>
+                      <w:lang w:eastAsia="en-US"/>
+                    </w:rPr>
+                    <w:t xml:space="preserve"> - 1</w:t>
                   </w:r>
                 </w:p>
               </w:tc>
@@ -1455,8 +4207,19 @@
                       <w:color w:val="000000" w:themeColor="text1"/>
                       <w:lang w:eastAsia="en-US"/>
                     </w:rPr>
-                    <w:t>Nama Kegiatan</w:t>
+                    <w:t xml:space="preserve">Nama </w:t>
                   </w:r>
+                  <w:proofErr w:type="spellStart"/>
+                  <w:r>
+                    <w:rPr>
+                      <w:b/>
+                      <w:i/>
+                      <w:color w:val="000000" w:themeColor="text1"/>
+                      <w:lang w:eastAsia="en-US"/>
+                    </w:rPr>
+                    <w:t>Kegiatan</w:t>
+                  </w:r>
+                  <w:proofErr w:type="spellEnd"/>
                 </w:p>
               </w:tc>
               <w:tc>
@@ -1485,6 +4248,7 @@
                       <w:lang w:eastAsia="en-US"/>
                     </w:rPr>
                   </w:pPr>
+                  <w:proofErr w:type="spellStart"/>
                   <w:r>
                     <w:rPr>
                       <w:b/>
@@ -1494,6 +4258,7 @@
                     </w:rPr>
                     <w:t>Bulan</w:t>
                   </w:r>
+                  <w:proofErr w:type="spellEnd"/>
                 </w:p>
               </w:tc>
             </w:tr>
@@ -2628,6 +5393,7 @@
                       <w:lang w:eastAsia="en-US"/>
                     </w:rPr>
                   </w:pPr>
+                  <w:proofErr w:type="spellStart"/>
                   <w:r>
                     <w:rPr>
                       <w:rFonts w:asciiTheme="minorHAnsi" w:eastAsiaTheme="minorHAnsi" w:hAnsiTheme="minorHAnsi" w:cstheme="minorBidi"/>
@@ -2636,7 +5402,40 @@
                       <w:color w:val="000000" w:themeColor="text1"/>
                       <w:lang w:eastAsia="en-US"/>
                     </w:rPr>
-                    <w:t>Tahun Ke - n</w:t>
+                    <w:t>Tahun</w:t>
+                  </w:r>
+                  <w:proofErr w:type="spellEnd"/>
+                  <w:r>
+                    <w:rPr>
+                      <w:rFonts w:asciiTheme="minorHAnsi" w:eastAsiaTheme="minorHAnsi" w:hAnsiTheme="minorHAnsi" w:cstheme="minorBidi"/>
+                      <w:b/>
+                      <w:i/>
+                      <w:color w:val="000000" w:themeColor="text1"/>
+                      <w:lang w:eastAsia="en-US"/>
+                    </w:rPr>
+                    <w:t xml:space="preserve"> </w:t>
+                  </w:r>
+                  <w:proofErr w:type="spellStart"/>
+                  <w:r>
+                    <w:rPr>
+                      <w:rFonts w:asciiTheme="minorHAnsi" w:eastAsiaTheme="minorHAnsi" w:hAnsiTheme="minorHAnsi" w:cstheme="minorBidi"/>
+                      <w:b/>
+                      <w:i/>
+                      <w:color w:val="000000" w:themeColor="text1"/>
+                      <w:lang w:eastAsia="en-US"/>
+                    </w:rPr>
+                    <w:t>Ke</w:t>
+                  </w:r>
+                  <w:proofErr w:type="spellEnd"/>
+                  <w:r>
+                    <w:rPr>
+                      <w:rFonts w:asciiTheme="minorHAnsi" w:eastAsiaTheme="minorHAnsi" w:hAnsiTheme="minorHAnsi" w:cstheme="minorBidi"/>
+                      <w:b/>
+                      <w:i/>
+                      <w:color w:val="000000" w:themeColor="text1"/>
+                      <w:lang w:eastAsia="en-US"/>
+                    </w:rPr>
+                    <w:t xml:space="preserve"> - n</w:t>
                   </w:r>
                 </w:p>
               </w:tc>
@@ -2715,8 +5514,19 @@
                       <w:color w:val="000000" w:themeColor="text1"/>
                       <w:lang w:eastAsia="en-US"/>
                     </w:rPr>
-                    <w:t>Nama Kegiatan</w:t>
+                    <w:t xml:space="preserve">Nama </w:t>
                   </w:r>
+                  <w:proofErr w:type="spellStart"/>
+                  <w:r>
+                    <w:rPr>
+                      <w:b/>
+                      <w:i/>
+                      <w:color w:val="000000" w:themeColor="text1"/>
+                      <w:lang w:eastAsia="en-US"/>
+                    </w:rPr>
+                    <w:t>Kegiatan</w:t>
+                  </w:r>
+                  <w:proofErr w:type="spellEnd"/>
                 </w:p>
               </w:tc>
               <w:tc>
@@ -2745,6 +5555,7 @@
                       <w:lang w:eastAsia="en-US"/>
                     </w:rPr>
                   </w:pPr>
+                  <w:proofErr w:type="spellStart"/>
                   <w:r>
                     <w:rPr>
                       <w:b/>
@@ -2754,6 +5565,7 @@
                     </w:rPr>
                     <w:t>Bulan</w:t>
                   </w:r>
+                  <w:proofErr w:type="spellEnd"/>
                 </w:p>
               </w:tc>
             </w:tr>
@@ -3383,7 +6195,6 @@
                       <w:color w:val="000000" w:themeColor="text1"/>
                       <w:lang w:eastAsia="en-US"/>
                     </w:rPr>
-                    <w:lastRenderedPageBreak/>
                     <w:t>2</w:t>
                   </w:r>
                 </w:p>
@@ -3938,12 +6749,277 @@
                 <w:lang w:eastAsia="en-US"/>
               </w:rPr>
             </w:pPr>
-            <w:r>
-              <w:rPr>
-                <w:color w:val="000000" w:themeColor="text1"/>
-                <w:lang w:eastAsia="en-US"/>
-              </w:rPr>
-              <w:t>Sitasi disusun dan ditulis berdasarkan sistem nomor sesuai dengan urutan pengutipan. Hanya pustaka yang disitasi pada usulan penelitian yang dicantumkan dalam Daftar Pustaka.</w:t>
+            <w:proofErr w:type="spellStart"/>
+            <w:r>
+              <w:rPr>
+                <w:color w:val="000000" w:themeColor="text1"/>
+                <w:lang w:eastAsia="en-US"/>
+              </w:rPr>
+              <w:t>Sitasi</w:t>
+            </w:r>
+            <w:proofErr w:type="spellEnd"/>
+            <w:r>
+              <w:rPr>
+                <w:color w:val="000000" w:themeColor="text1"/>
+                <w:lang w:eastAsia="en-US"/>
+              </w:rPr>
+              <w:t xml:space="preserve"> </w:t>
+            </w:r>
+            <w:proofErr w:type="spellStart"/>
+            <w:r>
+              <w:rPr>
+                <w:color w:val="000000" w:themeColor="text1"/>
+                <w:lang w:eastAsia="en-US"/>
+              </w:rPr>
+              <w:t>disusun</w:t>
+            </w:r>
+            <w:proofErr w:type="spellEnd"/>
+            <w:r>
+              <w:rPr>
+                <w:color w:val="000000" w:themeColor="text1"/>
+                <w:lang w:eastAsia="en-US"/>
+              </w:rPr>
+              <w:t xml:space="preserve"> dan </w:t>
+            </w:r>
+            <w:proofErr w:type="spellStart"/>
+            <w:r>
+              <w:rPr>
+                <w:color w:val="000000" w:themeColor="text1"/>
+                <w:lang w:eastAsia="en-US"/>
+              </w:rPr>
+              <w:t>ditulis</w:t>
+            </w:r>
+            <w:proofErr w:type="spellEnd"/>
+            <w:r>
+              <w:rPr>
+                <w:color w:val="000000" w:themeColor="text1"/>
+                <w:lang w:eastAsia="en-US"/>
+              </w:rPr>
+              <w:t xml:space="preserve"> </w:t>
+            </w:r>
+            <w:proofErr w:type="spellStart"/>
+            <w:r>
+              <w:rPr>
+                <w:color w:val="000000" w:themeColor="text1"/>
+                <w:lang w:eastAsia="en-US"/>
+              </w:rPr>
+              <w:t>berdasarkan</w:t>
+            </w:r>
+            <w:proofErr w:type="spellEnd"/>
+            <w:r>
+              <w:rPr>
+                <w:color w:val="000000" w:themeColor="text1"/>
+                <w:lang w:eastAsia="en-US"/>
+              </w:rPr>
+              <w:t xml:space="preserve"> </w:t>
+            </w:r>
+            <w:proofErr w:type="spellStart"/>
+            <w:r>
+              <w:rPr>
+                <w:color w:val="000000" w:themeColor="text1"/>
+                <w:lang w:eastAsia="en-US"/>
+              </w:rPr>
+              <w:t>sistem</w:t>
+            </w:r>
+            <w:proofErr w:type="spellEnd"/>
+            <w:r>
+              <w:rPr>
+                <w:color w:val="000000" w:themeColor="text1"/>
+                <w:lang w:eastAsia="en-US"/>
+              </w:rPr>
+              <w:t xml:space="preserve"> </w:t>
+            </w:r>
+            <w:proofErr w:type="spellStart"/>
+            <w:r>
+              <w:rPr>
+                <w:color w:val="000000" w:themeColor="text1"/>
+                <w:lang w:eastAsia="en-US"/>
+              </w:rPr>
+              <w:t>nomor</w:t>
+            </w:r>
+            <w:proofErr w:type="spellEnd"/>
+            <w:r>
+              <w:rPr>
+                <w:color w:val="000000" w:themeColor="text1"/>
+                <w:lang w:eastAsia="en-US"/>
+              </w:rPr>
+              <w:t xml:space="preserve"> </w:t>
+            </w:r>
+            <w:proofErr w:type="spellStart"/>
+            <w:r>
+              <w:rPr>
+                <w:color w:val="000000" w:themeColor="text1"/>
+                <w:lang w:eastAsia="en-US"/>
+              </w:rPr>
+              <w:t>sesuai</w:t>
+            </w:r>
+            <w:proofErr w:type="spellEnd"/>
+            <w:r>
+              <w:rPr>
+                <w:color w:val="000000" w:themeColor="text1"/>
+                <w:lang w:eastAsia="en-US"/>
+              </w:rPr>
+              <w:t xml:space="preserve"> </w:t>
+            </w:r>
+            <w:proofErr w:type="spellStart"/>
+            <w:r>
+              <w:rPr>
+                <w:color w:val="000000" w:themeColor="text1"/>
+                <w:lang w:eastAsia="en-US"/>
+              </w:rPr>
+              <w:t>dengan</w:t>
+            </w:r>
+            <w:proofErr w:type="spellEnd"/>
+            <w:r>
+              <w:rPr>
+                <w:color w:val="000000" w:themeColor="text1"/>
+                <w:lang w:eastAsia="en-US"/>
+              </w:rPr>
+              <w:t xml:space="preserve"> </w:t>
+            </w:r>
+            <w:proofErr w:type="spellStart"/>
+            <w:r>
+              <w:rPr>
+                <w:color w:val="000000" w:themeColor="text1"/>
+                <w:lang w:eastAsia="en-US"/>
+              </w:rPr>
+              <w:t>urutan</w:t>
+            </w:r>
+            <w:proofErr w:type="spellEnd"/>
+            <w:r>
+              <w:rPr>
+                <w:color w:val="000000" w:themeColor="text1"/>
+                <w:lang w:eastAsia="en-US"/>
+              </w:rPr>
+              <w:t xml:space="preserve"> </w:t>
+            </w:r>
+            <w:proofErr w:type="spellStart"/>
+            <w:r>
+              <w:rPr>
+                <w:color w:val="000000" w:themeColor="text1"/>
+                <w:lang w:eastAsia="en-US"/>
+              </w:rPr>
+              <w:t>pengutipan</w:t>
+            </w:r>
+            <w:proofErr w:type="spellEnd"/>
+            <w:r>
+              <w:rPr>
+                <w:color w:val="000000" w:themeColor="text1"/>
+                <w:lang w:eastAsia="en-US"/>
+              </w:rPr>
+              <w:t xml:space="preserve">. </w:t>
+            </w:r>
+            <w:proofErr w:type="spellStart"/>
+            <w:r>
+              <w:rPr>
+                <w:color w:val="000000" w:themeColor="text1"/>
+                <w:lang w:eastAsia="en-US"/>
+              </w:rPr>
+              <w:t>Hanya</w:t>
+            </w:r>
+            <w:proofErr w:type="spellEnd"/>
+            <w:r>
+              <w:rPr>
+                <w:color w:val="000000" w:themeColor="text1"/>
+                <w:lang w:eastAsia="en-US"/>
+              </w:rPr>
+              <w:t xml:space="preserve"> </w:t>
+            </w:r>
+            <w:proofErr w:type="spellStart"/>
+            <w:r>
+              <w:rPr>
+                <w:color w:val="000000" w:themeColor="text1"/>
+                <w:lang w:eastAsia="en-US"/>
+              </w:rPr>
+              <w:t>pustaka</w:t>
+            </w:r>
+            <w:proofErr w:type="spellEnd"/>
+            <w:r>
+              <w:rPr>
+                <w:color w:val="000000" w:themeColor="text1"/>
+                <w:lang w:eastAsia="en-US"/>
+              </w:rPr>
+              <w:t xml:space="preserve"> yang </w:t>
+            </w:r>
+            <w:proofErr w:type="spellStart"/>
+            <w:r>
+              <w:rPr>
+                <w:color w:val="000000" w:themeColor="text1"/>
+                <w:lang w:eastAsia="en-US"/>
+              </w:rPr>
+              <w:t>disitasi</w:t>
+            </w:r>
+            <w:proofErr w:type="spellEnd"/>
+            <w:r>
+              <w:rPr>
+                <w:color w:val="000000" w:themeColor="text1"/>
+                <w:lang w:eastAsia="en-US"/>
+              </w:rPr>
+              <w:t xml:space="preserve"> pada </w:t>
+            </w:r>
+            <w:proofErr w:type="spellStart"/>
+            <w:r>
+              <w:rPr>
+                <w:color w:val="000000" w:themeColor="text1"/>
+                <w:lang w:eastAsia="en-US"/>
+              </w:rPr>
+              <w:t>usulan</w:t>
+            </w:r>
+            <w:proofErr w:type="spellEnd"/>
+            <w:r>
+              <w:rPr>
+                <w:color w:val="000000" w:themeColor="text1"/>
+                <w:lang w:eastAsia="en-US"/>
+              </w:rPr>
+              <w:t xml:space="preserve"> </w:t>
+            </w:r>
+            <w:proofErr w:type="spellStart"/>
+            <w:r>
+              <w:rPr>
+                <w:color w:val="000000" w:themeColor="text1"/>
+                <w:lang w:eastAsia="en-US"/>
+              </w:rPr>
+              <w:t>penelitian</w:t>
+            </w:r>
+            <w:proofErr w:type="spellEnd"/>
+            <w:r>
+              <w:rPr>
+                <w:color w:val="000000" w:themeColor="text1"/>
+                <w:lang w:eastAsia="en-US"/>
+              </w:rPr>
+              <w:t xml:space="preserve"> yang </w:t>
+            </w:r>
+            <w:proofErr w:type="spellStart"/>
+            <w:r>
+              <w:rPr>
+                <w:color w:val="000000" w:themeColor="text1"/>
+                <w:lang w:eastAsia="en-US"/>
+              </w:rPr>
+              <w:t>dicantumkan</w:t>
+            </w:r>
+            <w:proofErr w:type="spellEnd"/>
+            <w:r>
+              <w:rPr>
+                <w:color w:val="000000" w:themeColor="text1"/>
+                <w:lang w:eastAsia="en-US"/>
+              </w:rPr>
+              <w:t xml:space="preserve"> </w:t>
+            </w:r>
+            <w:proofErr w:type="spellStart"/>
+            <w:r>
+              <w:rPr>
+                <w:color w:val="000000" w:themeColor="text1"/>
+                <w:lang w:eastAsia="en-US"/>
+              </w:rPr>
+              <w:t>dalam</w:t>
+            </w:r>
+            <w:proofErr w:type="spellEnd"/>
+            <w:r>
+              <w:rPr>
+                <w:color w:val="000000" w:themeColor="text1"/>
+                <w:lang w:eastAsia="en-US"/>
+              </w:rPr>
+              <w:t xml:space="preserve"> Daftar Pustaka.</w:t>
             </w:r>
           </w:p>
         </w:tc>
@@ -3980,7 +7056,15 @@
               <w:contextualSpacing/>
             </w:pPr>
             <w:r>
-              <w:t>…………………………………………………………………..……………………… dst.</w:t>
+              <w:t xml:space="preserve">…………………………………………………………………..……………………… </w:t>
+            </w:r>
+            <w:proofErr w:type="spellStart"/>
+            <w:r>
+              <w:t>dst</w:t>
+            </w:r>
+            <w:proofErr w:type="spellEnd"/>
+            <w:r>
+              <w:t>.</w:t>
             </w:r>
           </w:p>
           <w:p>
@@ -4281,7 +7365,12 @@
     </w:p>
     <w:p/>
     <w:sectPr>
-      <w:headerReference w:type="default" r:id="rId8"/>
+      <w:headerReference w:type="even" r:id="rId8"/>
+      <w:headerReference w:type="default" r:id="rId9"/>
+      <w:footerReference w:type="even" r:id="rId10"/>
+      <w:footerReference w:type="default" r:id="rId11"/>
+      <w:headerReference w:type="first" r:id="rId12"/>
+      <w:footerReference w:type="first" r:id="rId13"/>
       <w:type w:val="continuous"/>
       <w:pgSz w:w="11906" w:h="16838" w:code="9"/>
       <w:pgMar w:top="1338" w:right="1259" w:bottom="278" w:left="1338" w:header="709" w:footer="709" w:gutter="0"/>
@@ -4293,7 +7382,7 @@
 </file>
 
 <file path=word/endnotes.xml><?xml version="1.0" encoding="utf-8"?>
-<w:endnotes xmlns:wpc="http://schemas.microsoft.com/office/word/2010/wordprocessingCanvas" xmlns:cx="http://schemas.microsoft.com/office/drawing/2014/chartex" xmlns:cx1="http://schemas.microsoft.com/office/drawing/2015/9/8/chartex" xmlns:cx2="http://schemas.microsoft.com/office/drawing/2015/10/21/chartex" xmlns:cx3="http://schemas.microsoft.com/office/drawing/2016/5/9/chartex" xmlns:cx4="http://schemas.microsoft.com/office/drawing/2016/5/10/chartex" xmlns:cx5="http://schemas.microsoft.com/office/drawing/2016/5/11/chartex" xmlns:cx6="http://schemas.microsoft.com/office/drawing/2016/5/12/chartex" xmlns:cx7="http://schemas.microsoft.com/office/drawing/2016/5/13/chartex" xmlns:cx8="http://schemas.microsoft.com/office/drawing/2016/5/14/chartex" xmlns:mc="http://schemas.openxmlformats.org/markup-compatibility/2006" xmlns:aink="http://schemas.microsoft.com/office/drawing/2016/ink" xmlns:am3d="http://schemas.microsoft.com/office/drawing/2017/model3d" xmlns:o="urn:schemas-microsoft-com:office:office" xmlns:oel="http://schemas.microsoft.com/office/2019/extlst" xmlns:r="http://schemas.openxmlformats.org/officeDocument/2006/relationships" xmlns:m="http://schemas.openxmlformats.org/officeDocument/2006/math" xmlns:v="urn:schemas-microsoft-com:vml" xmlns:wp14="http://schemas.microsoft.com/office/word/2010/wordprocessingDrawing" xmlns:wp="http://schemas.openxmlformats.org/drawingml/2006/wordprocessingDrawing" xmlns:w10="urn:schemas-microsoft-com:office:word" xmlns:w="http://schemas.openxmlformats.org/wordprocessingml/2006/main" xmlns:w14="http://schemas.microsoft.com/office/word/2010/wordml" xmlns:w15="http://schemas.microsoft.com/office/word/2012/wordml" xmlns:w16cex="http://schemas.microsoft.com/office/word/2018/wordml/cex" xmlns:w16cid="http://schemas.microsoft.com/office/word/2016/wordml/cid" xmlns:w16="http://schemas.microsoft.com/office/word/2018/wordml" xmlns:w16du="http://schemas.microsoft.com/office/word/2023/wordml/word16du" xmlns:w16sdtdh="http://schemas.microsoft.com/office/word/2020/wordml/sdtdatahash" xmlns:w16se="http://schemas.microsoft.com/office/word/2015/wordml/symex" xmlns:wpg="http://schemas.microsoft.com/office/word/2010/wordprocessingGroup" xmlns:wpi="http://schemas.microsoft.com/office/word/2010/wordprocessingInk" xmlns:wne="http://schemas.microsoft.com/office/word/2006/wordml" xmlns:wps="http://schemas.microsoft.com/office/word/2010/wordprocessingShape" mc:Ignorable="w14 w15 w16se w16cid w16 w16cex w16sdtdh w16du wp14">
+<w:endnotes xmlns:wpc="http://schemas.microsoft.com/office/word/2010/wordprocessingCanvas" xmlns:cx="http://schemas.microsoft.com/office/drawing/2014/chartex" xmlns:cx1="http://schemas.microsoft.com/office/drawing/2015/9/8/chartex" xmlns:cx2="http://schemas.microsoft.com/office/drawing/2015/10/21/chartex" xmlns:cx3="http://schemas.microsoft.com/office/drawing/2016/5/9/chartex" xmlns:cx4="http://schemas.microsoft.com/office/drawing/2016/5/10/chartex" xmlns:cx5="http://schemas.microsoft.com/office/drawing/2016/5/11/chartex" xmlns:cx6="http://schemas.microsoft.com/office/drawing/2016/5/12/chartex" xmlns:cx7="http://schemas.microsoft.com/office/drawing/2016/5/13/chartex" xmlns:cx8="http://schemas.microsoft.com/office/drawing/2016/5/14/chartex" xmlns:mc="http://schemas.openxmlformats.org/markup-compatibility/2006" xmlns:aink="http://schemas.microsoft.com/office/drawing/2016/ink" xmlns:am3d="http://schemas.microsoft.com/office/drawing/2017/model3d" xmlns:o="urn:schemas-microsoft-com:office:office" xmlns:r="http://schemas.openxmlformats.org/officeDocument/2006/relationships" xmlns:m="http://schemas.openxmlformats.org/officeDocument/2006/math" xmlns:v="urn:schemas-microsoft-com:vml" xmlns:wp14="http://schemas.microsoft.com/office/word/2010/wordprocessingDrawing" xmlns:wp="http://schemas.openxmlformats.org/drawingml/2006/wordprocessingDrawing" xmlns:w10="urn:schemas-microsoft-com:office:word" xmlns:w="http://schemas.openxmlformats.org/wordprocessingml/2006/main" xmlns:w14="http://schemas.microsoft.com/office/word/2010/wordml" xmlns:w15="http://schemas.microsoft.com/office/word/2012/wordml" xmlns:w16cex="http://schemas.microsoft.com/office/word/2018/wordml/cex" xmlns:w16cid="http://schemas.microsoft.com/office/word/2016/wordml/cid" xmlns:w16="http://schemas.microsoft.com/office/word/2018/wordml" xmlns:w16sdtdh="http://schemas.microsoft.com/office/word/2020/wordml/sdtdatahash" xmlns:w16se="http://schemas.microsoft.com/office/word/2015/wordml/symex" xmlns:wpg="http://schemas.microsoft.com/office/word/2010/wordprocessingGroup" xmlns:wpi="http://schemas.microsoft.com/office/word/2010/wordprocessingInk" xmlns:wne="http://schemas.microsoft.com/office/word/2006/wordml" xmlns:wps="http://schemas.microsoft.com/office/word/2010/wordprocessingShape" mc:Ignorable="w14 w15 w16se w16cid w16 w16cex w16sdtdh wp14">
   <w:endnote w:type="separator" w:id="-1">
     <w:p>
       <w:r>
@@ -4311,8 +7400,38 @@
 </w:endnotes>
 </file>
 
+<file path=word/footer1.xml><?xml version="1.0" encoding="utf-8"?>
+<w:ftr xmlns:wpc="http://schemas.microsoft.com/office/word/2010/wordprocessingCanvas" xmlns:cx="http://schemas.microsoft.com/office/drawing/2014/chartex" xmlns:cx1="http://schemas.microsoft.com/office/drawing/2015/9/8/chartex" xmlns:cx2="http://schemas.microsoft.com/office/drawing/2015/10/21/chartex" xmlns:cx3="http://schemas.microsoft.com/office/drawing/2016/5/9/chartex" xmlns:cx4="http://schemas.microsoft.com/office/drawing/2016/5/10/chartex" xmlns:cx5="http://schemas.microsoft.com/office/drawing/2016/5/11/chartex" xmlns:cx6="http://schemas.microsoft.com/office/drawing/2016/5/12/chartex" xmlns:cx7="http://schemas.microsoft.com/office/drawing/2016/5/13/chartex" xmlns:cx8="http://schemas.microsoft.com/office/drawing/2016/5/14/chartex" xmlns:mc="http://schemas.openxmlformats.org/markup-compatibility/2006" xmlns:aink="http://schemas.microsoft.com/office/drawing/2016/ink" xmlns:am3d="http://schemas.microsoft.com/office/drawing/2017/model3d" xmlns:o="urn:schemas-microsoft-com:office:office" xmlns:r="http://schemas.openxmlformats.org/officeDocument/2006/relationships" xmlns:m="http://schemas.openxmlformats.org/officeDocument/2006/math" xmlns:v="urn:schemas-microsoft-com:vml" xmlns:wp14="http://schemas.microsoft.com/office/word/2010/wordprocessingDrawing" xmlns:wp="http://schemas.openxmlformats.org/drawingml/2006/wordprocessingDrawing" xmlns:w10="urn:schemas-microsoft-com:office:word" xmlns:w="http://schemas.openxmlformats.org/wordprocessingml/2006/main" xmlns:w14="http://schemas.microsoft.com/office/word/2010/wordml" xmlns:w15="http://schemas.microsoft.com/office/word/2012/wordml" xmlns:w16cex="http://schemas.microsoft.com/office/word/2018/wordml/cex" xmlns:w16cid="http://schemas.microsoft.com/office/word/2016/wordml/cid" xmlns:w16="http://schemas.microsoft.com/office/word/2018/wordml" xmlns:w16sdtdh="http://schemas.microsoft.com/office/word/2020/wordml/sdtdatahash" xmlns:w16se="http://schemas.microsoft.com/office/word/2015/wordml/symex" xmlns:wpg="http://schemas.microsoft.com/office/word/2010/wordprocessingGroup" xmlns:wpi="http://schemas.microsoft.com/office/word/2010/wordprocessingInk" xmlns:wne="http://schemas.microsoft.com/office/word/2006/wordml" xmlns:wps="http://schemas.microsoft.com/office/word/2010/wordprocessingShape" mc:Ignorable="w14 w15 w16se w16cid w16 w16cex w16sdtdh wp14">
+  <w:p>
+    <w:pPr>
+      <w:pStyle w:val="Footer"/>
+    </w:pPr>
+  </w:p>
+</w:ftr>
+</file>
+
+<file path=word/footer2.xml><?xml version="1.0" encoding="utf-8"?>
+<w:ftr xmlns:wpc="http://schemas.microsoft.com/office/word/2010/wordprocessingCanvas" xmlns:cx="http://schemas.microsoft.com/office/drawing/2014/chartex" xmlns:cx1="http://schemas.microsoft.com/office/drawing/2015/9/8/chartex" xmlns:cx2="http://schemas.microsoft.com/office/drawing/2015/10/21/chartex" xmlns:cx3="http://schemas.microsoft.com/office/drawing/2016/5/9/chartex" xmlns:cx4="http://schemas.microsoft.com/office/drawing/2016/5/10/chartex" xmlns:cx5="http://schemas.microsoft.com/office/drawing/2016/5/11/chartex" xmlns:cx6="http://schemas.microsoft.com/office/drawing/2016/5/12/chartex" xmlns:cx7="http://schemas.microsoft.com/office/drawing/2016/5/13/chartex" xmlns:cx8="http://schemas.microsoft.com/office/drawing/2016/5/14/chartex" xmlns:mc="http://schemas.openxmlformats.org/markup-compatibility/2006" xmlns:aink="http://schemas.microsoft.com/office/drawing/2016/ink" xmlns:am3d="http://schemas.microsoft.com/office/drawing/2017/model3d" xmlns:o="urn:schemas-microsoft-com:office:office" xmlns:r="http://schemas.openxmlformats.org/officeDocument/2006/relationships" xmlns:m="http://schemas.openxmlformats.org/officeDocument/2006/math" xmlns:v="urn:schemas-microsoft-com:vml" xmlns:wp14="http://schemas.microsoft.com/office/word/2010/wordprocessingDrawing" xmlns:wp="http://schemas.openxmlformats.org/drawingml/2006/wordprocessingDrawing" xmlns:w10="urn:schemas-microsoft-com:office:word" xmlns:w="http://schemas.openxmlformats.org/wordprocessingml/2006/main" xmlns:w14="http://schemas.microsoft.com/office/word/2010/wordml" xmlns:w15="http://schemas.microsoft.com/office/word/2012/wordml" xmlns:w16cex="http://schemas.microsoft.com/office/word/2018/wordml/cex" xmlns:w16cid="http://schemas.microsoft.com/office/word/2016/wordml/cid" xmlns:w16="http://schemas.microsoft.com/office/word/2018/wordml" xmlns:w16sdtdh="http://schemas.microsoft.com/office/word/2020/wordml/sdtdatahash" xmlns:w16se="http://schemas.microsoft.com/office/word/2015/wordml/symex" xmlns:wpg="http://schemas.microsoft.com/office/word/2010/wordprocessingGroup" xmlns:wpi="http://schemas.microsoft.com/office/word/2010/wordprocessingInk" xmlns:wne="http://schemas.microsoft.com/office/word/2006/wordml" xmlns:wps="http://schemas.microsoft.com/office/word/2010/wordprocessingShape" mc:Ignorable="w14 w15 w16se w16cid w16 w16cex w16sdtdh wp14">
+  <w:p>
+    <w:pPr>
+      <w:pStyle w:val="Footer"/>
+    </w:pPr>
+  </w:p>
+</w:ftr>
+</file>
+
+<file path=word/footer3.xml><?xml version="1.0" encoding="utf-8"?>
+<w:ftr xmlns:wpc="http://schemas.microsoft.com/office/word/2010/wordprocessingCanvas" xmlns:cx="http://schemas.microsoft.com/office/drawing/2014/chartex" xmlns:cx1="http://schemas.microsoft.com/office/drawing/2015/9/8/chartex" xmlns:cx2="http://schemas.microsoft.com/office/drawing/2015/10/21/chartex" xmlns:cx3="http://schemas.microsoft.com/office/drawing/2016/5/9/chartex" xmlns:cx4="http://schemas.microsoft.com/office/drawing/2016/5/10/chartex" xmlns:cx5="http://schemas.microsoft.com/office/drawing/2016/5/11/chartex" xmlns:cx6="http://schemas.microsoft.com/office/drawing/2016/5/12/chartex" xmlns:cx7="http://schemas.microsoft.com/office/drawing/2016/5/13/chartex" xmlns:cx8="http://schemas.microsoft.com/office/drawing/2016/5/14/chartex" xmlns:mc="http://schemas.openxmlformats.org/markup-compatibility/2006" xmlns:aink="http://schemas.microsoft.com/office/drawing/2016/ink" xmlns:am3d="http://schemas.microsoft.com/office/drawing/2017/model3d" xmlns:o="urn:schemas-microsoft-com:office:office" xmlns:r="http://schemas.openxmlformats.org/officeDocument/2006/relationships" xmlns:m="http://schemas.openxmlformats.org/officeDocument/2006/math" xmlns:v="urn:schemas-microsoft-com:vml" xmlns:wp14="http://schemas.microsoft.com/office/word/2010/wordprocessingDrawing" xmlns:wp="http://schemas.openxmlformats.org/drawingml/2006/wordprocessingDrawing" xmlns:w10="urn:schemas-microsoft-com:office:word" xmlns:w="http://schemas.openxmlformats.org/wordprocessingml/2006/main" xmlns:w14="http://schemas.microsoft.com/office/word/2010/wordml" xmlns:w15="http://schemas.microsoft.com/office/word/2012/wordml" xmlns:w16cex="http://schemas.microsoft.com/office/word/2018/wordml/cex" xmlns:w16cid="http://schemas.microsoft.com/office/word/2016/wordml/cid" xmlns:w16="http://schemas.microsoft.com/office/word/2018/wordml" xmlns:w16sdtdh="http://schemas.microsoft.com/office/word/2020/wordml/sdtdatahash" xmlns:w16se="http://schemas.microsoft.com/office/word/2015/wordml/symex" xmlns:wpg="http://schemas.microsoft.com/office/word/2010/wordprocessingGroup" xmlns:wpi="http://schemas.microsoft.com/office/word/2010/wordprocessingInk" xmlns:wne="http://schemas.microsoft.com/office/word/2006/wordml" xmlns:wps="http://schemas.microsoft.com/office/word/2010/wordprocessingShape" mc:Ignorable="w14 w15 w16se w16cid w16 w16cex w16sdtdh wp14">
+  <w:p>
+    <w:pPr>
+      <w:pStyle w:val="Footer"/>
+    </w:pPr>
+  </w:p>
+</w:ftr>
+</file>
+
 <file path=word/footnotes.xml><?xml version="1.0" encoding="utf-8"?>
-<w:footnotes xmlns:wpc="http://schemas.microsoft.com/office/word/2010/wordprocessingCanvas" xmlns:cx="http://schemas.microsoft.com/office/drawing/2014/chartex" xmlns:cx1="http://schemas.microsoft.com/office/drawing/2015/9/8/chartex" xmlns:cx2="http://schemas.microsoft.com/office/drawing/2015/10/21/chartex" xmlns:cx3="http://schemas.microsoft.com/office/drawing/2016/5/9/chartex" xmlns:cx4="http://schemas.microsoft.com/office/drawing/2016/5/10/chartex" xmlns:cx5="http://schemas.microsoft.com/office/drawing/2016/5/11/chartex" xmlns:cx6="http://schemas.microsoft.com/office/drawing/2016/5/12/chartex" xmlns:cx7="http://schemas.microsoft.com/office/drawing/2016/5/13/chartex" xmlns:cx8="http://schemas.microsoft.com/office/drawing/2016/5/14/chartex" xmlns:mc="http://schemas.openxmlformats.org/markup-compatibility/2006" xmlns:aink="http://schemas.microsoft.com/office/drawing/2016/ink" xmlns:am3d="http://schemas.microsoft.com/office/drawing/2017/model3d" xmlns:o="urn:schemas-microsoft-com:office:office" xmlns:oel="http://schemas.microsoft.com/office/2019/extlst" xmlns:r="http://schemas.openxmlformats.org/officeDocument/2006/relationships" xmlns:m="http://schemas.openxmlformats.org/officeDocument/2006/math" xmlns:v="urn:schemas-microsoft-com:vml" xmlns:wp14="http://schemas.microsoft.com/office/word/2010/wordprocessingDrawing" xmlns:wp="http://schemas.openxmlformats.org/drawingml/2006/wordprocessingDrawing" xmlns:w10="urn:schemas-microsoft-com:office:word" xmlns:w="http://schemas.openxmlformats.org/wordprocessingml/2006/main" xmlns:w14="http://schemas.microsoft.com/office/word/2010/wordml" xmlns:w15="http://schemas.microsoft.com/office/word/2012/wordml" xmlns:w16cex="http://schemas.microsoft.com/office/word/2018/wordml/cex" xmlns:w16cid="http://schemas.microsoft.com/office/word/2016/wordml/cid" xmlns:w16="http://schemas.microsoft.com/office/word/2018/wordml" xmlns:w16du="http://schemas.microsoft.com/office/word/2023/wordml/word16du" xmlns:w16sdtdh="http://schemas.microsoft.com/office/word/2020/wordml/sdtdatahash" xmlns:w16se="http://schemas.microsoft.com/office/word/2015/wordml/symex" xmlns:wpg="http://schemas.microsoft.com/office/word/2010/wordprocessingGroup" xmlns:wpi="http://schemas.microsoft.com/office/word/2010/wordprocessingInk" xmlns:wne="http://schemas.microsoft.com/office/word/2006/wordml" xmlns:wps="http://schemas.microsoft.com/office/word/2010/wordprocessingShape" mc:Ignorable="w14 w15 w16se w16cid w16 w16cex w16sdtdh w16du wp14">
+<w:footnotes xmlns:wpc="http://schemas.microsoft.com/office/word/2010/wordprocessingCanvas" xmlns:cx="http://schemas.microsoft.com/office/drawing/2014/chartex" xmlns:cx1="http://schemas.microsoft.com/office/drawing/2015/9/8/chartex" xmlns:cx2="http://schemas.microsoft.com/office/drawing/2015/10/21/chartex" xmlns:cx3="http://schemas.microsoft.com/office/drawing/2016/5/9/chartex" xmlns:cx4="http://schemas.microsoft.com/office/drawing/2016/5/10/chartex" xmlns:cx5="http://schemas.microsoft.com/office/drawing/2016/5/11/chartex" xmlns:cx6="http://schemas.microsoft.com/office/drawing/2016/5/12/chartex" xmlns:cx7="http://schemas.microsoft.com/office/drawing/2016/5/13/chartex" xmlns:cx8="http://schemas.microsoft.com/office/drawing/2016/5/14/chartex" xmlns:mc="http://schemas.openxmlformats.org/markup-compatibility/2006" xmlns:aink="http://schemas.microsoft.com/office/drawing/2016/ink" xmlns:am3d="http://schemas.microsoft.com/office/drawing/2017/model3d" xmlns:o="urn:schemas-microsoft-com:office:office" xmlns:r="http://schemas.openxmlformats.org/officeDocument/2006/relationships" xmlns:m="http://schemas.openxmlformats.org/officeDocument/2006/math" xmlns:v="urn:schemas-microsoft-com:vml" xmlns:wp14="http://schemas.microsoft.com/office/word/2010/wordprocessingDrawing" xmlns:wp="http://schemas.openxmlformats.org/drawingml/2006/wordprocessingDrawing" xmlns:w10="urn:schemas-microsoft-com:office:word" xmlns:w="http://schemas.openxmlformats.org/wordprocessingml/2006/main" xmlns:w14="http://schemas.microsoft.com/office/word/2010/wordml" xmlns:w15="http://schemas.microsoft.com/office/word/2012/wordml" xmlns:w16cex="http://schemas.microsoft.com/office/word/2018/wordml/cex" xmlns:w16cid="http://schemas.microsoft.com/office/word/2016/wordml/cid" xmlns:w16="http://schemas.microsoft.com/office/word/2018/wordml" xmlns:w16sdtdh="http://schemas.microsoft.com/office/word/2020/wordml/sdtdatahash" xmlns:w16se="http://schemas.microsoft.com/office/word/2015/wordml/symex" xmlns:wpg="http://schemas.microsoft.com/office/word/2010/wordprocessingGroup" xmlns:wpi="http://schemas.microsoft.com/office/word/2010/wordprocessingInk" xmlns:wne="http://schemas.microsoft.com/office/word/2006/wordml" xmlns:wps="http://schemas.microsoft.com/office/word/2010/wordprocessingShape" mc:Ignorable="w14 w15 w16se w16cid w16 w16cex w16sdtdh wp14">
   <w:footnote w:type="separator" w:id="-1">
     <w:p>
       <w:r>
@@ -4331,7 +7450,17 @@
 </file>
 
 <file path=word/header1.xml><?xml version="1.0" encoding="utf-8"?>
-<w:hdr xmlns:wpc="http://schemas.microsoft.com/office/word/2010/wordprocessingCanvas" xmlns:cx="http://schemas.microsoft.com/office/drawing/2014/chartex" xmlns:cx1="http://schemas.microsoft.com/office/drawing/2015/9/8/chartex" xmlns:cx2="http://schemas.microsoft.com/office/drawing/2015/10/21/chartex" xmlns:cx3="http://schemas.microsoft.com/office/drawing/2016/5/9/chartex" xmlns:cx4="http://schemas.microsoft.com/office/drawing/2016/5/10/chartex" xmlns:cx5="http://schemas.microsoft.com/office/drawing/2016/5/11/chartex" xmlns:cx6="http://schemas.microsoft.com/office/drawing/2016/5/12/chartex" xmlns:cx7="http://schemas.microsoft.com/office/drawing/2016/5/13/chartex" xmlns:cx8="http://schemas.microsoft.com/office/drawing/2016/5/14/chartex" xmlns:mc="http://schemas.openxmlformats.org/markup-compatibility/2006" xmlns:aink="http://schemas.microsoft.com/office/drawing/2016/ink" xmlns:am3d="http://schemas.microsoft.com/office/drawing/2017/model3d" xmlns:o="urn:schemas-microsoft-com:office:office" xmlns:oel="http://schemas.microsoft.com/office/2019/extlst" xmlns:r="http://schemas.openxmlformats.org/officeDocument/2006/relationships" xmlns:m="http://schemas.openxmlformats.org/officeDocument/2006/math" xmlns:v="urn:schemas-microsoft-com:vml" xmlns:wp14="http://schemas.microsoft.com/office/word/2010/wordprocessingDrawing" xmlns:wp="http://schemas.openxmlformats.org/drawingml/2006/wordprocessingDrawing" xmlns:w10="urn:schemas-microsoft-com:office:word" xmlns:w="http://schemas.openxmlformats.org/wordprocessingml/2006/main" xmlns:w14="http://schemas.microsoft.com/office/word/2010/wordml" xmlns:w15="http://schemas.microsoft.com/office/word/2012/wordml" xmlns:w16cex="http://schemas.microsoft.com/office/word/2018/wordml/cex" xmlns:w16cid="http://schemas.microsoft.com/office/word/2016/wordml/cid" xmlns:w16="http://schemas.microsoft.com/office/word/2018/wordml" xmlns:w16du="http://schemas.microsoft.com/office/word/2023/wordml/word16du" xmlns:w16sdtdh="http://schemas.microsoft.com/office/word/2020/wordml/sdtdatahash" xmlns:w16se="http://schemas.microsoft.com/office/word/2015/wordml/symex" xmlns:wpg="http://schemas.microsoft.com/office/word/2010/wordprocessingGroup" xmlns:wpi="http://schemas.microsoft.com/office/word/2010/wordprocessingInk" xmlns:wne="http://schemas.microsoft.com/office/word/2006/wordml" xmlns:wps="http://schemas.microsoft.com/office/word/2010/wordprocessingShape" mc:Ignorable="w14 w15 w16se w16cid w16 w16cex w16sdtdh w16du wp14">
+<w:hdr xmlns:wpc="http://schemas.microsoft.com/office/word/2010/wordprocessingCanvas" xmlns:cx="http://schemas.microsoft.com/office/drawing/2014/chartex" xmlns:cx1="http://schemas.microsoft.com/office/drawing/2015/9/8/chartex" xmlns:cx2="http://schemas.microsoft.com/office/drawing/2015/10/21/chartex" xmlns:cx3="http://schemas.microsoft.com/office/drawing/2016/5/9/chartex" xmlns:cx4="http://schemas.microsoft.com/office/drawing/2016/5/10/chartex" xmlns:cx5="http://schemas.microsoft.com/office/drawing/2016/5/11/chartex" xmlns:cx6="http://schemas.microsoft.com/office/drawing/2016/5/12/chartex" xmlns:cx7="http://schemas.microsoft.com/office/drawing/2016/5/13/chartex" xmlns:cx8="http://schemas.microsoft.com/office/drawing/2016/5/14/chartex" xmlns:mc="http://schemas.openxmlformats.org/markup-compatibility/2006" xmlns:aink="http://schemas.microsoft.com/office/drawing/2016/ink" xmlns:am3d="http://schemas.microsoft.com/office/drawing/2017/model3d" xmlns:o="urn:schemas-microsoft-com:office:office" xmlns:r="http://schemas.openxmlformats.org/officeDocument/2006/relationships" xmlns:m="http://schemas.openxmlformats.org/officeDocument/2006/math" xmlns:v="urn:schemas-microsoft-com:vml" xmlns:wp14="http://schemas.microsoft.com/office/word/2010/wordprocessingDrawing" xmlns:wp="http://schemas.openxmlformats.org/drawingml/2006/wordprocessingDrawing" xmlns:w10="urn:schemas-microsoft-com:office:word" xmlns:w="http://schemas.openxmlformats.org/wordprocessingml/2006/main" xmlns:w14="http://schemas.microsoft.com/office/word/2010/wordml" xmlns:w15="http://schemas.microsoft.com/office/word/2012/wordml" xmlns:w16cex="http://schemas.microsoft.com/office/word/2018/wordml/cex" xmlns:w16cid="http://schemas.microsoft.com/office/word/2016/wordml/cid" xmlns:w16="http://schemas.microsoft.com/office/word/2018/wordml" xmlns:w16sdtdh="http://schemas.microsoft.com/office/word/2020/wordml/sdtdatahash" xmlns:w16se="http://schemas.microsoft.com/office/word/2015/wordml/symex" xmlns:wpg="http://schemas.microsoft.com/office/word/2010/wordprocessingGroup" xmlns:wpi="http://schemas.microsoft.com/office/word/2010/wordprocessingInk" xmlns:wne="http://schemas.microsoft.com/office/word/2006/wordml" xmlns:wps="http://schemas.microsoft.com/office/word/2010/wordprocessingShape" mc:Ignorable="w14 w15 w16se w16cid w16 w16cex w16sdtdh wp14">
+  <w:p>
+    <w:pPr>
+      <w:pStyle w:val="Header"/>
+    </w:pPr>
+  </w:p>
+</w:hdr>
+</file>
+
+<file path=word/header2.xml><?xml version="1.0" encoding="utf-8"?>
+<w:hdr xmlns:wpc="http://schemas.microsoft.com/office/word/2010/wordprocessingCanvas" xmlns:cx="http://schemas.microsoft.com/office/drawing/2014/chartex" xmlns:cx1="http://schemas.microsoft.com/office/drawing/2015/9/8/chartex" xmlns:cx2="http://schemas.microsoft.com/office/drawing/2015/10/21/chartex" xmlns:cx3="http://schemas.microsoft.com/office/drawing/2016/5/9/chartex" xmlns:cx4="http://schemas.microsoft.com/office/drawing/2016/5/10/chartex" xmlns:cx5="http://schemas.microsoft.com/office/drawing/2016/5/11/chartex" xmlns:cx6="http://schemas.microsoft.com/office/drawing/2016/5/12/chartex" xmlns:cx7="http://schemas.microsoft.com/office/drawing/2016/5/13/chartex" xmlns:cx8="http://schemas.microsoft.com/office/drawing/2016/5/14/chartex" xmlns:mc="http://schemas.openxmlformats.org/markup-compatibility/2006" xmlns:aink="http://schemas.microsoft.com/office/drawing/2016/ink" xmlns:am3d="http://schemas.microsoft.com/office/drawing/2017/model3d" xmlns:o="urn:schemas-microsoft-com:office:office" xmlns:r="http://schemas.openxmlformats.org/officeDocument/2006/relationships" xmlns:m="http://schemas.openxmlformats.org/officeDocument/2006/math" xmlns:v="urn:schemas-microsoft-com:vml" xmlns:wp14="http://schemas.microsoft.com/office/word/2010/wordprocessingDrawing" xmlns:wp="http://schemas.openxmlformats.org/drawingml/2006/wordprocessingDrawing" xmlns:w10="urn:schemas-microsoft-com:office:word" xmlns:w="http://schemas.openxmlformats.org/wordprocessingml/2006/main" xmlns:w14="http://schemas.microsoft.com/office/word/2010/wordml" xmlns:w15="http://schemas.microsoft.com/office/word/2012/wordml" xmlns:w16cex="http://schemas.microsoft.com/office/word/2018/wordml/cex" xmlns:w16cid="http://schemas.microsoft.com/office/word/2016/wordml/cid" xmlns:w16="http://schemas.microsoft.com/office/word/2018/wordml" xmlns:w16sdtdh="http://schemas.microsoft.com/office/word/2020/wordml/sdtdatahash" xmlns:w16se="http://schemas.microsoft.com/office/word/2015/wordml/symex" xmlns:wpg="http://schemas.microsoft.com/office/word/2010/wordprocessingGroup" xmlns:wpi="http://schemas.microsoft.com/office/word/2010/wordprocessingInk" xmlns:wne="http://schemas.microsoft.com/office/word/2006/wordml" xmlns:wps="http://schemas.microsoft.com/office/word/2010/wordprocessingShape" mc:Ignorable="w14 w15 w16se w16cid w16 w16cex w16sdtdh wp14">
   <w:p>
     <w:pPr>
       <w:rPr>
@@ -4355,8 +7484,8 @@
       <w:tblLook w:val="04A0" w:firstRow="1" w:lastRow="0" w:firstColumn="1" w:lastColumn="0" w:noHBand="0" w:noVBand="1"/>
     </w:tblPr>
     <w:tblGrid>
-      <w:gridCol w:w="2009"/>
-      <w:gridCol w:w="7300"/>
+      <w:gridCol w:w="1416"/>
+      <w:gridCol w:w="7886"/>
     </w:tblGrid>
     <w:tr>
       <w:tc>
@@ -4373,14 +7502,12 @@
           <w:r>
             <w:rPr>
               <w:noProof/>
-              <w:color w:val="000000" w:themeColor="text1"/>
-              <w:lang w:eastAsia="en-US"/>
             </w:rPr>
             <w:drawing>
-              <wp:inline distT="0" distB="0" distL="0" distR="0" wp14:anchorId="41AFC691" wp14:editId="290C8CDC">
-                <wp:extent cx="1130300" cy="799066"/>
-                <wp:effectExtent l="0" t="0" r="8255" b="6350"/>
-                <wp:docPr id="1593267507" name="Picture 2"/>
+              <wp:inline distT="0" distB="0" distL="0" distR="0" wp14:anchorId="3DA07527" wp14:editId="6F202D7C">
+                <wp:extent cx="762000" cy="381000"/>
+                <wp:effectExtent l="0" t="0" r="0" b="0"/>
+                <wp:docPr id="1" name="Picture 1"/>
                 <wp:cNvGraphicFramePr>
                   <a:graphicFrameLocks xmlns:a="http://schemas.openxmlformats.org/drawingml/2006/main" noChangeAspect="1"/>
                 </wp:cNvGraphicFramePr>
@@ -4388,8 +7515,10 @@
                   <a:graphicData uri="http://schemas.openxmlformats.org/drawingml/2006/picture">
                     <pic:pic xmlns:pic="http://schemas.openxmlformats.org/drawingml/2006/picture">
                       <pic:nvPicPr>
-                        <pic:cNvPr id="1593267507" name="Picture 1593267507"/>
-                        <pic:cNvPicPr/>
+                        <pic:cNvPr id="0" name="Picture 1"/>
+                        <pic:cNvPicPr>
+                          <a:picLocks noChangeAspect="1" noChangeArrowheads="1"/>
+                        </pic:cNvPicPr>
                       </pic:nvPicPr>
                       <pic:blipFill>
                         <a:blip r:embed="rId1">
@@ -4399,18 +7528,23 @@
                             </a:ext>
                           </a:extLst>
                         </a:blip>
+                        <a:srcRect/>
                         <a:stretch>
                           <a:fillRect/>
                         </a:stretch>
                       </pic:blipFill>
-                      <pic:spPr>
+                      <pic:spPr bwMode="auto">
                         <a:xfrm>
                           <a:off x="0" y="0"/>
-                          <a:ext cx="1130300" cy="799066"/>
+                          <a:ext cx="777721" cy="388861"/>
                         </a:xfrm>
                         <a:prstGeom prst="rect">
                           <a:avLst/>
                         </a:prstGeom>
+                        <a:noFill/>
+                        <a:ln>
+                          <a:noFill/>
+                        </a:ln>
                       </pic:spPr>
                     </pic:pic>
                   </a:graphicData>
@@ -4456,6 +7590,7 @@
             </w:rPr>
             <w:t xml:space="preserve">SKEMA </w:t>
           </w:r>
+          <w:proofErr w:type="spellStart"/>
           <w:r>
             <w:rPr>
               <w:rFonts w:cs="Calibri"/>
@@ -4464,7 +7599,40 @@
               <w:w w:val="95"/>
               <w:lang w:val="en-US"/>
             </w:rPr>
-            <w:t>Pemberdayaan Berbasis Masyarakat</w:t>
+            <w:t>Pemberdayaan</w:t>
+          </w:r>
+          <w:proofErr w:type="spellEnd"/>
+          <w:r>
+            <w:rPr>
+              <w:rFonts w:cs="Calibri"/>
+              <w:b/>
+              <w:bCs/>
+              <w:w w:val="95"/>
+              <w:lang w:val="en-US"/>
+            </w:rPr>
+            <w:t xml:space="preserve"> </w:t>
+          </w:r>
+          <w:proofErr w:type="spellStart"/>
+          <w:r>
+            <w:rPr>
+              <w:rFonts w:cs="Calibri"/>
+              <w:b/>
+              <w:bCs/>
+              <w:w w:val="95"/>
+              <w:lang w:val="en-US"/>
+            </w:rPr>
+            <w:t>Berbasis</w:t>
+          </w:r>
+          <w:proofErr w:type="spellEnd"/>
+          <w:r>
+            <w:rPr>
+              <w:rFonts w:cs="Calibri"/>
+              <w:b/>
+              <w:bCs/>
+              <w:w w:val="95"/>
+              <w:lang w:val="en-US"/>
+            </w:rPr>
+            <w:t xml:space="preserve"> Masyarakat</w:t>
           </w:r>
         </w:p>
         <w:p>
@@ -4475,12 +7643,37 @@
               <w:szCs w:val="18"/>
             </w:rPr>
           </w:pPr>
+          <w:proofErr w:type="spellStart"/>
           <w:r>
             <w:rPr>
               <w:sz w:val="18"/>
               <w:szCs w:val="18"/>
             </w:rPr>
-            <w:t>Petunjuk:Pengusul hanya diperkenankan mengisi di tempat yang telah disediakan sesuai dengan petunjuk pengisian dan tidak diperkenankan melakukan modifikasi template atau penghapusan di setiap bagian.</w:t>
+            <w:t>Petunjuk:Pengusul</w:t>
+          </w:r>
+          <w:proofErr w:type="spellEnd"/>
+          <w:r>
+            <w:rPr>
+              <w:sz w:val="18"/>
+              <w:szCs w:val="18"/>
+            </w:rPr>
+            <w:t xml:space="preserve"> hanya diperkenankan mengisi di tempat yang telah disediakan sesuai dengan petunjuk pengisian dan tidak diperkenankan melakukan modifikasi </w:t>
+          </w:r>
+          <w:proofErr w:type="spellStart"/>
+          <w:r>
+            <w:rPr>
+              <w:sz w:val="18"/>
+              <w:szCs w:val="18"/>
+            </w:rPr>
+            <w:t>template</w:t>
+          </w:r>
+          <w:proofErr w:type="spellEnd"/>
+          <w:r>
+            <w:rPr>
+              <w:sz w:val="18"/>
+              <w:szCs w:val="18"/>
+            </w:rPr>
+            <w:t xml:space="preserve"> atau penghapusan di setiap bagian.</w:t>
           </w:r>
         </w:p>
       </w:tc>
@@ -4502,8 +7695,18 @@
 </w:hdr>
 </file>
 
+<file path=word/header3.xml><?xml version="1.0" encoding="utf-8"?>
+<w:hdr xmlns:wpc="http://schemas.microsoft.com/office/word/2010/wordprocessingCanvas" xmlns:cx="http://schemas.microsoft.com/office/drawing/2014/chartex" xmlns:cx1="http://schemas.microsoft.com/office/drawing/2015/9/8/chartex" xmlns:cx2="http://schemas.microsoft.com/office/drawing/2015/10/21/chartex" xmlns:cx3="http://schemas.microsoft.com/office/drawing/2016/5/9/chartex" xmlns:cx4="http://schemas.microsoft.com/office/drawing/2016/5/10/chartex" xmlns:cx5="http://schemas.microsoft.com/office/drawing/2016/5/11/chartex" xmlns:cx6="http://schemas.microsoft.com/office/drawing/2016/5/12/chartex" xmlns:cx7="http://schemas.microsoft.com/office/drawing/2016/5/13/chartex" xmlns:cx8="http://schemas.microsoft.com/office/drawing/2016/5/14/chartex" xmlns:mc="http://schemas.openxmlformats.org/markup-compatibility/2006" xmlns:aink="http://schemas.microsoft.com/office/drawing/2016/ink" xmlns:am3d="http://schemas.microsoft.com/office/drawing/2017/model3d" xmlns:o="urn:schemas-microsoft-com:office:office" xmlns:r="http://schemas.openxmlformats.org/officeDocument/2006/relationships" xmlns:m="http://schemas.openxmlformats.org/officeDocument/2006/math" xmlns:v="urn:schemas-microsoft-com:vml" xmlns:wp14="http://schemas.microsoft.com/office/word/2010/wordprocessingDrawing" xmlns:wp="http://schemas.openxmlformats.org/drawingml/2006/wordprocessingDrawing" xmlns:w10="urn:schemas-microsoft-com:office:word" xmlns:w="http://schemas.openxmlformats.org/wordprocessingml/2006/main" xmlns:w14="http://schemas.microsoft.com/office/word/2010/wordml" xmlns:w15="http://schemas.microsoft.com/office/word/2012/wordml" xmlns:w16cex="http://schemas.microsoft.com/office/word/2018/wordml/cex" xmlns:w16cid="http://schemas.microsoft.com/office/word/2016/wordml/cid" xmlns:w16="http://schemas.microsoft.com/office/word/2018/wordml" xmlns:w16sdtdh="http://schemas.microsoft.com/office/word/2020/wordml/sdtdatahash" xmlns:w16se="http://schemas.microsoft.com/office/word/2015/wordml/symex" xmlns:wpg="http://schemas.microsoft.com/office/word/2010/wordprocessingGroup" xmlns:wpi="http://schemas.microsoft.com/office/word/2010/wordprocessingInk" xmlns:wne="http://schemas.microsoft.com/office/word/2006/wordml" xmlns:wps="http://schemas.microsoft.com/office/word/2010/wordprocessingShape" mc:Ignorable="w14 w15 w16se w16cid w16 w16cex w16sdtdh wp14">
+  <w:p>
+    <w:pPr>
+      <w:pStyle w:val="Header"/>
+    </w:pPr>
+  </w:p>
+</w:hdr>
+</file>
+
 <file path=word/numbering.xml><?xml version="1.0" encoding="utf-8"?>
-<w:numbering xmlns:wpc="http://schemas.microsoft.com/office/word/2010/wordprocessingCanvas" xmlns:cx="http://schemas.microsoft.com/office/drawing/2014/chartex" xmlns:cx1="http://schemas.microsoft.com/office/drawing/2015/9/8/chartex" xmlns:cx2="http://schemas.microsoft.com/office/drawing/2015/10/21/chartex" xmlns:cx3="http://schemas.microsoft.com/office/drawing/2016/5/9/chartex" xmlns:cx4="http://schemas.microsoft.com/office/drawing/2016/5/10/chartex" xmlns:cx5="http://schemas.microsoft.com/office/drawing/2016/5/11/chartex" xmlns:cx6="http://schemas.microsoft.com/office/drawing/2016/5/12/chartex" xmlns:cx7="http://schemas.microsoft.com/office/drawing/2016/5/13/chartex" xmlns:cx8="http://schemas.microsoft.com/office/drawing/2016/5/14/chartex" xmlns:mc="http://schemas.openxmlformats.org/markup-compatibility/2006" xmlns:aink="http://schemas.microsoft.com/office/drawing/2016/ink" xmlns:am3d="http://schemas.microsoft.com/office/drawing/2017/model3d" xmlns:o="urn:schemas-microsoft-com:office:office" xmlns:oel="http://schemas.microsoft.com/office/2019/extlst" xmlns:r="http://schemas.openxmlformats.org/officeDocument/2006/relationships" xmlns:m="http://schemas.openxmlformats.org/officeDocument/2006/math" xmlns:v="urn:schemas-microsoft-com:vml" xmlns:wp14="http://schemas.microsoft.com/office/word/2010/wordprocessingDrawing" xmlns:wp="http://schemas.openxmlformats.org/drawingml/2006/wordprocessingDrawing" xmlns:w10="urn:schemas-microsoft-com:office:word" xmlns:w="http://schemas.openxmlformats.org/wordprocessingml/2006/main" xmlns:w14="http://schemas.microsoft.com/office/word/2010/wordml" xmlns:w15="http://schemas.microsoft.com/office/word/2012/wordml" xmlns:w16cex="http://schemas.microsoft.com/office/word/2018/wordml/cex" xmlns:w16cid="http://schemas.microsoft.com/office/word/2016/wordml/cid" xmlns:w16="http://schemas.microsoft.com/office/word/2018/wordml" xmlns:w16du="http://schemas.microsoft.com/office/word/2023/wordml/word16du" xmlns:w16sdtdh="http://schemas.microsoft.com/office/word/2020/wordml/sdtdatahash" xmlns:w16se="http://schemas.microsoft.com/office/word/2015/wordml/symex" xmlns:wpg="http://schemas.microsoft.com/office/word/2010/wordprocessingGroup" xmlns:wpi="http://schemas.microsoft.com/office/word/2010/wordprocessingInk" xmlns:wne="http://schemas.microsoft.com/office/word/2006/wordml" xmlns:wps="http://schemas.microsoft.com/office/word/2010/wordprocessingShape" mc:Ignorable="w14 w15 w16se w16cid w16 w16cex w16sdtdh w16du wp14">
+<w:numbering xmlns:wpc="http://schemas.microsoft.com/office/word/2010/wordprocessingCanvas" xmlns:cx="http://schemas.microsoft.com/office/drawing/2014/chartex" xmlns:cx1="http://schemas.microsoft.com/office/drawing/2015/9/8/chartex" xmlns:cx2="http://schemas.microsoft.com/office/drawing/2015/10/21/chartex" xmlns:cx3="http://schemas.microsoft.com/office/drawing/2016/5/9/chartex" xmlns:cx4="http://schemas.microsoft.com/office/drawing/2016/5/10/chartex" xmlns:cx5="http://schemas.microsoft.com/office/drawing/2016/5/11/chartex" xmlns:cx6="http://schemas.microsoft.com/office/drawing/2016/5/12/chartex" xmlns:cx7="http://schemas.microsoft.com/office/drawing/2016/5/13/chartex" xmlns:cx8="http://schemas.microsoft.com/office/drawing/2016/5/14/chartex" xmlns:mc="http://schemas.openxmlformats.org/markup-compatibility/2006" xmlns:aink="http://schemas.microsoft.com/office/drawing/2016/ink" xmlns:am3d="http://schemas.microsoft.com/office/drawing/2017/model3d" xmlns:o="urn:schemas-microsoft-com:office:office" xmlns:r="http://schemas.openxmlformats.org/officeDocument/2006/relationships" xmlns:m="http://schemas.openxmlformats.org/officeDocument/2006/math" xmlns:v="urn:schemas-microsoft-com:vml" xmlns:wp14="http://schemas.microsoft.com/office/word/2010/wordprocessingDrawing" xmlns:wp="http://schemas.openxmlformats.org/drawingml/2006/wordprocessingDrawing" xmlns:w10="urn:schemas-microsoft-com:office:word" xmlns:w="http://schemas.openxmlformats.org/wordprocessingml/2006/main" xmlns:w14="http://schemas.microsoft.com/office/word/2010/wordml" xmlns:w15="http://schemas.microsoft.com/office/word/2012/wordml" xmlns:w16cex="http://schemas.microsoft.com/office/word/2018/wordml/cex" xmlns:w16cid="http://schemas.microsoft.com/office/word/2016/wordml/cid" xmlns:w16="http://schemas.microsoft.com/office/word/2018/wordml" xmlns:w16sdtdh="http://schemas.microsoft.com/office/word/2020/wordml/sdtdatahash" xmlns:w16se="http://schemas.microsoft.com/office/word/2015/wordml/symex" xmlns:wpg="http://schemas.microsoft.com/office/word/2010/wordprocessingGroup" xmlns:wpi="http://schemas.microsoft.com/office/word/2010/wordprocessingInk" xmlns:wne="http://schemas.microsoft.com/office/word/2006/wordml" xmlns:wps="http://schemas.microsoft.com/office/word/2010/wordprocessingShape" mc:Ignorable="w14 w15 w16se w16cid w16 w16cex w16sdtdh wp14">
   <w:abstractNum w:abstractNumId="0" w15:restartNumberingAfterBreak="0">
     <w:nsid w:val="0FC22D45"/>
     <w:multiLevelType w:val="multilevel"/>
@@ -5169,32 +8372,32 @@
       </w:pPr>
     </w:lvl>
   </w:abstractNum>
-  <w:num w:numId="1" w16cid:durableId="1650403658">
+  <w:num w:numId="1">
     <w:abstractNumId w:val="2"/>
   </w:num>
-  <w:num w:numId="2" w16cid:durableId="622466310">
+  <w:num w:numId="2">
     <w:abstractNumId w:val="5"/>
   </w:num>
-  <w:num w:numId="3" w16cid:durableId="415827821">
+  <w:num w:numId="3">
     <w:abstractNumId w:val="0"/>
   </w:num>
-  <w:num w:numId="4" w16cid:durableId="854349225">
+  <w:num w:numId="4">
     <w:abstractNumId w:val="6"/>
   </w:num>
-  <w:num w:numId="5" w16cid:durableId="833178273">
+  <w:num w:numId="5">
     <w:abstractNumId w:val="4"/>
   </w:num>
-  <w:num w:numId="6" w16cid:durableId="1565799999">
+  <w:num w:numId="6">
     <w:abstractNumId w:val="3"/>
   </w:num>
-  <w:num w:numId="7" w16cid:durableId="239994706">
+  <w:num w:numId="7">
     <w:abstractNumId w:val="1"/>
   </w:num>
 </w:numbering>
 </file>
 
 <file path=word/styles.xml><?xml version="1.0" encoding="utf-8"?>
-<w:styles xmlns:mc="http://schemas.openxmlformats.org/markup-compatibility/2006" xmlns:r="http://schemas.openxmlformats.org/officeDocument/2006/relationships" xmlns:w="http://schemas.openxmlformats.org/wordprocessingml/2006/main" xmlns:w14="http://schemas.microsoft.com/office/word/2010/wordml" xmlns:w15="http://schemas.microsoft.com/office/word/2012/wordml" xmlns:w16cex="http://schemas.microsoft.com/office/word/2018/wordml/cex" xmlns:w16cid="http://schemas.microsoft.com/office/word/2016/wordml/cid" xmlns:w16="http://schemas.microsoft.com/office/word/2018/wordml" xmlns:w16du="http://schemas.microsoft.com/office/word/2023/wordml/word16du" xmlns:w16sdtdh="http://schemas.microsoft.com/office/word/2020/wordml/sdtdatahash" xmlns:w16se="http://schemas.microsoft.com/office/word/2015/wordml/symex" mc:Ignorable="w14 w15 w16se w16cid w16 w16cex w16sdtdh w16du">
+<w:styles xmlns:mc="http://schemas.openxmlformats.org/markup-compatibility/2006" xmlns:r="http://schemas.openxmlformats.org/officeDocument/2006/relationships" xmlns:w="http://schemas.openxmlformats.org/wordprocessingml/2006/main" xmlns:w14="http://schemas.microsoft.com/office/word/2010/wordml" xmlns:w15="http://schemas.microsoft.com/office/word/2012/wordml" xmlns:w16cex="http://schemas.microsoft.com/office/word/2018/wordml/cex" xmlns:w16cid="http://schemas.microsoft.com/office/word/2016/wordml/cid" xmlns:w16="http://schemas.microsoft.com/office/word/2018/wordml" xmlns:w16sdtdh="http://schemas.microsoft.com/office/word/2020/wordml/sdtdatahash" xmlns:w16se="http://schemas.microsoft.com/office/word/2015/wordml/symex" mc:Ignorable="w14 w15 w16se w16cid w16 w16cex w16sdtdh">
   <w:docDefaults>
     <w:rPrDefault>
       <w:rPr>

</xml_diff>